<commit_message>
docs(manual): conversation/source-only answers, model+reasoning selection, provider save vs test, org policy initial values, new-install initial data; rebuild docx/pdf; manual check uses node
</commit_message>
<xml_diff>
--- a/apps/web/public/manual/daon-user-manual.docx
+++ b/apps/web/public/manual/daon-user-manual.docx
@@ -469,7 +469,7 @@
         <w:spacing w:after="0" w:line="216" w:lineRule="auto"/>
         <w:ind w:left="0"/>
       </w:pPr>
-      <w:hyperlink w:anchor="toc_46">
+      <w:hyperlink w:anchor="toc_48">
         <w:r>
           <w:rPr>
             <w:rFonts w:ascii="Noto Sans" w:hAnsi="Noto Sans" w:eastAsia="Gulim"/>
@@ -487,7 +487,7 @@
         <w:spacing w:after="0" w:line="216" w:lineRule="auto"/>
         <w:ind w:left="0"/>
       </w:pPr>
-      <w:hyperlink w:anchor="toc_47">
+      <w:hyperlink w:anchor="toc_49">
         <w:r>
           <w:rPr>
             <w:rFonts w:ascii="Noto Sans" w:hAnsi="Noto Sans" w:eastAsia="Gulim"/>
@@ -505,7 +505,7 @@
         <w:spacing w:after="0" w:line="216" w:lineRule="auto"/>
         <w:ind w:left="0"/>
       </w:pPr>
-      <w:hyperlink w:anchor="toc_54">
+      <w:hyperlink w:anchor="toc_56">
         <w:r>
           <w:rPr>
             <w:rFonts w:ascii="Noto Sans" w:hAnsi="Noto Sans" w:eastAsia="Gulim"/>
@@ -523,7 +523,7 @@
         <w:spacing w:after="0" w:line="216" w:lineRule="auto"/>
         <w:ind w:left="0"/>
       </w:pPr>
-      <w:hyperlink w:anchor="toc_61">
+      <w:hyperlink w:anchor="toc_66">
         <w:r>
           <w:rPr>
             <w:rFonts w:ascii="Noto Sans" w:hAnsi="Noto Sans" w:eastAsia="Gulim"/>
@@ -541,7 +541,7 @@
         <w:spacing w:after="0" w:line="216" w:lineRule="auto"/>
         <w:ind w:left="0"/>
       </w:pPr>
-      <w:hyperlink w:anchor="toc_62">
+      <w:hyperlink w:anchor="toc_67">
         <w:r>
           <w:rPr>
             <w:rFonts w:ascii="Noto Sans" w:hAnsi="Noto Sans" w:eastAsia="Gulim"/>
@@ -559,7 +559,7 @@
         <w:spacing w:after="0" w:line="216" w:lineRule="auto"/>
         <w:ind w:left="0"/>
       </w:pPr>
-      <w:hyperlink w:anchor="toc_63">
+      <w:hyperlink w:anchor="toc_68">
         <w:r>
           <w:rPr>
             <w:rFonts w:ascii="Noto Sans" w:hAnsi="Noto Sans" w:eastAsia="Gulim"/>
@@ -577,7 +577,7 @@
         <w:spacing w:after="0" w:line="216" w:lineRule="auto"/>
         <w:ind w:left="0"/>
       </w:pPr>
-      <w:hyperlink w:anchor="toc_64">
+      <w:hyperlink w:anchor="toc_69">
         <w:r>
           <w:rPr>
             <w:rFonts w:ascii="Noto Sans" w:hAnsi="Noto Sans" w:eastAsia="Gulim"/>
@@ -595,7 +595,7 @@
         <w:spacing w:after="0" w:line="216" w:lineRule="auto"/>
         <w:ind w:left="0"/>
       </w:pPr>
-      <w:hyperlink w:anchor="toc_67">
+      <w:hyperlink w:anchor="toc_72">
         <w:r>
           <w:rPr>
             <w:rFonts w:ascii="Noto Sans" w:hAnsi="Noto Sans" w:eastAsia="Gulim"/>
@@ -613,7 +613,7 @@
         <w:spacing w:after="0" w:line="216" w:lineRule="auto"/>
         <w:ind w:left="0"/>
       </w:pPr>
-      <w:hyperlink w:anchor="toc_68">
+      <w:hyperlink w:anchor="toc_73">
         <w:r>
           <w:rPr>
             <w:rFonts w:ascii="Noto Sans" w:hAnsi="Noto Sans" w:eastAsia="Gulim"/>
@@ -631,7 +631,7 @@
         <w:spacing w:after="0" w:line="216" w:lineRule="auto"/>
         <w:ind w:left="0"/>
       </w:pPr>
-      <w:hyperlink w:anchor="toc_69">
+      <w:hyperlink w:anchor="toc_74">
         <w:r>
           <w:rPr>
             <w:rFonts w:ascii="Noto Sans" w:hAnsi="Noto Sans" w:eastAsia="Gulim"/>
@@ -649,7 +649,7 @@
         <w:spacing w:after="0" w:line="216" w:lineRule="auto"/>
         <w:ind w:left="0"/>
       </w:pPr>
-      <w:hyperlink w:anchor="toc_70">
+      <w:hyperlink w:anchor="toc_75">
         <w:r>
           <w:rPr>
             <w:rFonts w:ascii="Noto Sans" w:hAnsi="Noto Sans" w:eastAsia="Gulim"/>
@@ -667,7 +667,7 @@
         <w:spacing w:after="0" w:line="216" w:lineRule="auto"/>
         <w:ind w:left="0"/>
       </w:pPr>
-      <w:hyperlink w:anchor="toc_71">
+      <w:hyperlink w:anchor="toc_76">
         <w:r>
           <w:rPr>
             <w:rFonts w:ascii="Noto Sans" w:hAnsi="Noto Sans" w:eastAsia="Gulim"/>
@@ -685,7 +685,7 @@
         <w:spacing w:after="0" w:line="216" w:lineRule="auto"/>
         <w:ind w:left="0"/>
       </w:pPr>
-      <w:hyperlink w:anchor="toc_72">
+      <w:hyperlink w:anchor="toc_77">
         <w:r>
           <w:rPr>
             <w:rFonts w:ascii="Noto Sans" w:hAnsi="Noto Sans" w:eastAsia="Gulim"/>
@@ -703,7 +703,7 @@
         <w:spacing w:after="0" w:line="216" w:lineRule="auto"/>
         <w:ind w:left="0"/>
       </w:pPr>
-      <w:hyperlink w:anchor="toc_73">
+      <w:hyperlink w:anchor="toc_78">
         <w:r>
           <w:rPr>
             <w:rFonts w:ascii="Noto Sans" w:hAnsi="Noto Sans" w:eastAsia="Gulim"/>
@@ -721,7 +721,7 @@
         <w:spacing w:after="0" w:line="216" w:lineRule="auto"/>
         <w:ind w:left="0"/>
       </w:pPr>
-      <w:hyperlink w:anchor="toc_84">
+      <w:hyperlink w:anchor="toc_89">
         <w:r>
           <w:rPr>
             <w:rFonts w:ascii="Noto Sans" w:hAnsi="Noto Sans" w:eastAsia="Gulim"/>
@@ -735,6 +735,24 @@
       </w:hyperlink>
     </w:p>
     <w:p>
+      <w:pPr>
+        <w:spacing w:after="0" w:line="216" w:lineRule="auto"/>
+        <w:ind w:left="0"/>
+      </w:pPr>
+      <w:hyperlink w:anchor="toc_90">
+        <w:r>
+          <w:rPr>
+            <w:rFonts w:ascii="Noto Sans" w:hAnsi="Noto Sans" w:eastAsia="Gulim"/>
+            <w:color w:val="2E74B5"/>
+            <w:u w:val="single"/>
+            <w:sz w:val="16"/>
+            <w:szCs w:val="16"/>
+          </w:rPr>
+          <w:t>26. 새 설치와 초기 데이터</w:t>
+        </w:r>
+      </w:hyperlink>
+    </w:p>
+    <w:p>
       <w:r>
         <w:br w:type="page"/>
       </w:r>
@@ -762,7 +780,7 @@
         </w:numPr>
       </w:pPr>
       <w:r>
-        <w:t>문서 업데이트: 2026-10-17</w:t>
+        <w:t>문서 업데이트: 2026-10-27</w:t>
       </w:r>
     </w:p>
     <w:p>
@@ -1480,7 +1498,7 @@
         </w:numPr>
       </w:pPr>
       <w:r>
-        <w:t>프로젝트 명령 python -m daon_user_api.admin_cli reset-initial-password를 정확히 한 번 실행합니다.</w:t>
+        <w:t>프로젝트 명령 python -m daon2_user_api.admin_cli reset-initial-password를 정확히 한 번 실행합니다.</w:t>
       </w:r>
     </w:p>
     <w:p>
@@ -2593,7 +2611,7 @@
         <w:pStyle w:val="Heading2"/>
       </w:pPr>
       <w:r>
-        <w:t>10.2 작업 상담</w:t>
+        <w:t>10.2 지식 질문과 일반 대화</w:t>
       </w:r>
       <w:bookmarkEnd w:id="43"/>
     </w:p>
@@ -2602,18 +2620,40 @@
         <w:widowControl/>
       </w:pPr>
       <w:r>
-        <w:t>Source를 선택하지 않은 경우 화면에는 작업 상담 · 근거 미사용이 표시됩니다. 현재 허용된 일반 대화는 인사, 감사, 도움말과 Daon 사용법처럼 좁은 범위입니다. 문서 사실이나 업무 판단에는 사용하지 않습니다.</w:t>
-      </w:r>
-    </w:p>
-    <w:p>
-      <w:bookmarkStart w:id="44" w:name="toc_44"/>
-      <w:pPr>
-        <w:pStyle w:val="Heading2"/>
-      </w:pPr>
-      <w:r>
-        <w:t>10.3 질문 작성 요령</w:t>
-      </w:r>
-      <w:bookmarkEnd w:id="44"/>
+        <w:t>Daon은 Source가 제공한 지식으로만 답합니다. 모델이 학습으로 알고 있는 내용은 답으로 쓰지 않습니다.</w:t>
+      </w:r>
+    </w:p>
+    <w:p>
+      <w:pPr>
+        <w:widowControl/>
+      </w:pPr>
+      <w:r>
+        <w:t>| 질문 종류 | Source가 없거나 근거를 못 찾을 때 | 근거가 있을 때 |</w:t>
+      </w:r>
+    </w:p>
+    <w:p>
+      <w:pPr>
+        <w:widowControl/>
+      </w:pPr>
+      <w:r>
+        <w:t>| --- | --- | --- |</w:t>
+      </w:r>
+    </w:p>
+    <w:p>
+      <w:pPr>
+        <w:widowControl/>
+      </w:pPr>
+      <w:r>
+        <w:t>| 지식 질문(문서 내용, 사실, 업무 판단) | 모델을 호출하지 않고 "지식이 제공되지 않았습니다. 소스를 추가하세요" 또는 "선택한 소스에서 관련 내용을 찾지 못했습니다"를 안내합니다. | Source 근거와 Citation으로 답합니다. |</w:t>
+      </w:r>
+    </w:p>
+    <w:p>
+      <w:pPr>
+        <w:widowControl/>
+      </w:pPr>
+      <w:r>
+        <w:t>| 일반 대화(인사, 감사, 할 수 있는 일, 사용법) | 소스 없이도 모델이 짧게 답합니다. 사실·도메인 질문에는 답하지 않고 소스 추가를 안내합니다. | 같습니다. |</w:t>
+      </w:r>
     </w:p>
     <w:p>
       <w:pPr>
@@ -2625,7 +2665,7 @@
         </w:numPr>
       </w:pPr>
       <w:r>
-        <w:t>무엇을 찾을지 명시합니다.</w:t>
+        <w:t>근거가 일부만 있으면 확인된 내용만 인용하고, 확인되지 않은 부분과 필요한 자료를 답변 끝에 밝히도록 모델에 지시합니다. 지시를 지키는지는 사람이 답변을 읽고 확인해야 합니다.</w:t>
       </w:r>
     </w:p>
     <w:p>
@@ -2638,7 +2678,7 @@
         </w:numPr>
       </w:pPr>
       <w:r>
-        <w:t>원하는 결과 형식을 적습니다.</w:t>
+        <w:t>일반 대화인지는 문장 형태로 판단합니다. "안녕, 삼성 매출 알려줘"처럼 인사와 질문이 섞이면 지식 질문으로 봅니다.</w:t>
       </w:r>
     </w:p>
     <w:p>
@@ -2651,44 +2691,18 @@
         </w:numPr>
       </w:pPr>
       <w:r>
-        <w:t>기간, 대상, 예외 조건을 포함합니다.</w:t>
-      </w:r>
-    </w:p>
-    <w:p>
-      <w:pPr>
-        <w:spacing w:after="80" w:line="300" w:lineRule="auto"/>
-        <w:ind w:left="540" w:hanging="271"/>
-        <w:numPr>
-          <w:ilvl w:val="0"/>
-          <w:numId w:val="27"/>
-        </w:numPr>
-      </w:pPr>
-      <w:r>
-        <w:t>한 질문에 너무 많은 업무를 섞지 않습니다.</w:t>
-      </w:r>
-    </w:p>
-    <w:p>
-      <w:pPr>
-        <w:spacing w:after="80" w:line="300" w:lineRule="auto"/>
-        <w:ind w:left="540" w:hanging="271"/>
-        <w:numPr>
-          <w:ilvl w:val="0"/>
-          <w:numId w:val="27"/>
-        </w:numPr>
-      </w:pPr>
-      <w:r>
-        <w:t>답변에 근거가 부족하면 범위를 좁혀 다시 질문합니다.</w:t>
-      </w:r>
-    </w:p>
-    <w:p>
-      <w:bookmarkStart w:id="45" w:name="toc_45"/>
+        <w:t>소스가 없어 모델을 호출하지 않는 질문은 외부 전송 정책·추가 인증 대상이 아닙니다.</w:t>
+      </w:r>
+    </w:p>
+    <w:p>
+      <w:bookmarkStart w:id="44" w:name="toc_44"/>
       <w:pPr>
         <w:pStyle w:val="Heading2"/>
       </w:pPr>
       <w:r>
-        <w:t>10.4 질문 실행 중 오류</w:t>
-      </w:r>
-      <w:bookmarkEnd w:id="45"/>
+        <w:t>10.3 질문 작성 요령</w:t>
+      </w:r>
+      <w:bookmarkEnd w:id="44"/>
     </w:p>
     <w:p>
       <w:pPr>
@@ -2700,7 +2714,7 @@
         </w:numPr>
       </w:pPr>
       <w:r>
-        <w:t>선택 모델이 없으면 LLM 설정을 확인합니다.</w:t>
+        <w:t>무엇을 찾을지 명시합니다.</w:t>
       </w:r>
     </w:p>
     <w:p>
@@ -2713,7 +2727,7 @@
         </w:numPr>
       </w:pPr>
       <w:r>
-        <w:t>Provider가 준비되지 않았으면 운영상태를 확인합니다.</w:t>
+        <w:t>원하는 결과 형식을 적습니다.</w:t>
       </w:r>
     </w:p>
     <w:p>
@@ -2726,7 +2740,7 @@
         </w:numPr>
       </w:pPr>
       <w:r>
-        <w:t>외부 전송이 차단되면 조직 정책을 확인합니다.</w:t>
+        <w:t>기간, 대상, 예외 조건을 포함합니다.</w:t>
       </w:r>
     </w:p>
     <w:p>
@@ -2739,7 +2753,7 @@
         </w:numPr>
       </w:pPr>
       <w:r>
-        <w:t>Source가 준비되지 않았으면 처리 완료를 기다립니다.</w:t>
+        <w:t>한 질문에 너무 많은 업무를 섞지 않습니다.</w:t>
       </w:r>
     </w:p>
     <w:p>
@@ -2752,26 +2766,18 @@
         </w:numPr>
       </w:pPr>
       <w:r>
-        <w:t>같은 요청을 빠르게 반복해 중복 Run을 만들지 않습니다.</w:t>
-      </w:r>
-    </w:p>
-    <w:p>
-      <w:bookmarkStart w:id="46" w:name="toc_46"/>
-      <w:pPr>
-        <w:pStyle w:val="Heading1"/>
-      </w:pPr>
-      <w:r>
-        <w:t>11. Citation 검토</w:t>
-      </w:r>
-      <w:bookmarkEnd w:id="46"/>
-    </w:p>
-    <w:p>
-      <w:pPr>
-        <w:widowControl/>
-      </w:pPr>
-      <w:r>
-        <w:t>Citation은 답변이 참조한 근거 위치입니다.</w:t>
-      </w:r>
+        <w:t>답변에 근거가 부족하면 범위를 좁혀 다시 질문합니다.</w:t>
+      </w:r>
+    </w:p>
+    <w:p>
+      <w:bookmarkStart w:id="45" w:name="toc_45"/>
+      <w:pPr>
+        <w:pStyle w:val="Heading2"/>
+      </w:pPr>
+      <w:r>
+        <w:t>10.4 질문 실행 중 오류</w:t>
+      </w:r>
+      <w:bookmarkEnd w:id="45"/>
     </w:p>
     <w:p>
       <w:pPr>
@@ -2783,7 +2789,7 @@
         </w:numPr>
       </w:pPr>
       <w:r>
-        <w:t>답변마다 Citation이 있는지 확인합니다.</w:t>
+        <w:t>선택 모델이 없으면 LLM 설정을 확인합니다.</w:t>
       </w:r>
     </w:p>
     <w:p>
@@ -2796,7 +2802,7 @@
         </w:numPr>
       </w:pPr>
       <w:r>
-        <w:t>PDF이면 표시된 페이지를 엽니다.</w:t>
+        <w:t>Provider가 준비되지 않았으면 운영상태를 확인합니다.</w:t>
       </w:r>
     </w:p>
     <w:p>
@@ -2809,7 +2815,7 @@
         </w:numPr>
       </w:pPr>
       <w:r>
-        <w:t>Daon 지식이면 지식 origin과 위치를 확인합니다.</w:t>
+        <w:t>외부 전송이 차단되면(EGRESS_POLICY_DENIED) 조직 정책과 Workspace 정책을 확인합니다(16장).</w:t>
       </w:r>
     </w:p>
     <w:p>
@@ -2822,7 +2828,7 @@
         </w:numPr>
       </w:pPr>
       <w:r>
-        <w:t>원문 문장과 답변 해석을 비교합니다.</w:t>
+        <w:t>직접 고른 모델을 쓸 수 없으면(SELECTED_MODEL_UNAVAILABLE) 다른 모델을 고르거나 기본 모델로 되돌립니다. Daon은 다른 모델로 자동 전환하지 않습니다.</w:t>
       </w:r>
     </w:p>
     <w:p>
@@ -2835,7 +2841,7 @@
         </w:numPr>
       </w:pPr>
       <w:r>
-        <w:t>질문에 선택하지 않은 Source가 섞이지 않았는지 확인합니다.</w:t>
+        <w:t>Source가 준비되지 않았으면 처리 완료를 기다립니다.</w:t>
       </w:r>
     </w:p>
     <w:p>
@@ -2848,36 +2854,18 @@
         </w:numPr>
       </w:pPr>
       <w:r>
-        <w:t>Citation이 없거나 불충분하면 결과를 승인하지 않습니다.</w:t>
-      </w:r>
-    </w:p>
-    <w:p>
-      <w:pPr>
-        <w:widowControl/>
-      </w:pPr>
-      <w:r>
-        <w:t>현재 Citation 화면은 페이지 또는 지식 위치 중심입니다. Source 이름, Version과 처리 상태는 Source 패널과 함께 대조합니다.</w:t>
-      </w:r>
-    </w:p>
-    <w:p>
-      <w:bookmarkStart w:id="47" w:name="toc_47"/>
-      <w:pPr>
-        <w:pStyle w:val="Heading1"/>
-      </w:pPr>
-      <w:r>
-        <w:t>12. 업무 Studio</w:t>
-      </w:r>
-      <w:bookmarkEnd w:id="47"/>
-    </w:p>
-    <w:p>
-      <w:bookmarkStart w:id="48" w:name="toc_48"/>
+        <w:t>같은 요청을 빠르게 반복해 중복 Run을 만들지 않습니다.</w:t>
+      </w:r>
+    </w:p>
+    <w:p>
+      <w:bookmarkStart w:id="46" w:name="toc_46"/>
       <w:pPr>
         <w:pStyle w:val="Heading2"/>
       </w:pPr>
       <w:r>
-        <w:t>12.1 산출물 유형과 형식</w:t>
-      </w:r>
-      <w:bookmarkEnd w:id="48"/>
+        <w:t>10.5 대화 기록</w:t>
+      </w:r>
+      <w:bookmarkEnd w:id="46"/>
     </w:p>
     <w:p>
       <w:pPr>
@@ -2889,7 +2877,7 @@
         </w:numPr>
       </w:pPr>
       <w:r>
-        <w:t>근거 기반 보고서: DOCX, PDF</w:t>
+        <w:t>질문과 답변은 대화창에 시간순으로 쌓입니다. 새 질문을 해도 앞선 질문·답변·실패 알림은 지워지지 않습니다.</w:t>
       </w:r>
     </w:p>
     <w:p>
@@ -2902,7 +2890,7 @@
         </w:numPr>
       </w:pPr>
       <w:r>
-        <w:t>제약·준수 점검표: XLSX, CSV, PDF</w:t>
+        <w:t>새로 고침하거나 다시 로그인하면 저장된 내 대화가 그대로 복원됩니다. 대화는 사용자별로 보입니다.</w:t>
       </w:r>
     </w:p>
     <w:p>
@@ -2915,7 +2903,7 @@
         </w:numPr>
       </w:pPr>
       <w:r>
-        <w:t>비교·데이터 표: XLSX, CSV, PDF</w:t>
+        <w:t>실패한 질문은 실패 알림과 함께 남습니다. 서버에 기록되지 않는 일시 오류는 새로 고침 뒤에는 남지 않을 수 있습니다.</w:t>
       </w:r>
     </w:p>
     <w:p>
@@ -2928,7 +2916,7 @@
         </w:numPr>
       </w:pPr>
       <w:r>
-        <w:t>지식 구조도: JSON, SVG, PNG, PDF</w:t>
+        <w:t>대화 새로고침(내 채팅 기록 비우기)은 내 대화창만 비우며 메모, 산출물, 다른 사용자의 대화는 그대로입니다.</w:t>
       </w:r>
     </w:p>
     <w:p>
@@ -2941,111 +2929,25 @@
         </w:numPr>
       </w:pPr>
       <w:r>
-        <w:t>업무 문서 초안: DOCX, PDF</w:t>
-      </w:r>
-    </w:p>
-    <w:p>
-      <w:pPr>
-        <w:spacing w:after="80" w:line="300" w:lineRule="auto"/>
-        <w:ind w:left="540" w:hanging="271"/>
-        <w:numPr>
-          <w:ilvl w:val="0"/>
-          <w:numId w:val="30"/>
-        </w:numPr>
-      </w:pPr>
-      <w:r>
-        <w:t>슬라이드: PDF, JSON</w:t>
-      </w:r>
-    </w:p>
-    <w:p>
-      <w:pPr>
-        <w:spacing w:after="80" w:line="300" w:lineRule="auto"/>
-        <w:ind w:left="540" w:hanging="271"/>
-        <w:numPr>
-          <w:ilvl w:val="0"/>
-          <w:numId w:val="30"/>
-        </w:numPr>
-      </w:pPr>
-      <w:r>
-        <w:t>인포그래픽: SVG, PNG, PDF, JSON</w:t>
-      </w:r>
-    </w:p>
-    <w:p>
-      <w:pPr>
-        <w:spacing w:after="80" w:line="300" w:lineRule="auto"/>
-        <w:ind w:left="540" w:hanging="271"/>
-        <w:numPr>
-          <w:ilvl w:val="0"/>
-          <w:numId w:val="30"/>
-        </w:numPr>
-      </w:pPr>
-      <w:r>
-        <w:t>플래시카드: JSON, CSV, PDF</w:t>
-      </w:r>
-    </w:p>
-    <w:p>
-      <w:pPr>
-        <w:spacing w:after="80" w:line="300" w:lineRule="auto"/>
-        <w:ind w:left="540" w:hanging="271"/>
-        <w:numPr>
-          <w:ilvl w:val="0"/>
-          <w:numId w:val="30"/>
-        </w:numPr>
-      </w:pPr>
-      <w:r>
-        <w:t>퀴즈: JSON, CSV, PDF</w:t>
-      </w:r>
-    </w:p>
-    <w:p>
-      <w:pPr>
-        <w:spacing w:after="80" w:line="300" w:lineRule="auto"/>
-        <w:ind w:left="540" w:hanging="271"/>
-        <w:numPr>
-          <w:ilvl w:val="0"/>
-          <w:numId w:val="30"/>
-        </w:numPr>
-      </w:pPr>
-      <w:r>
-        <w:t>AI 오디오: JSON 계약만 존재하며 전용 Provider가 없으면 사용 불가</w:t>
-      </w:r>
-    </w:p>
-    <w:p>
-      <w:pPr>
-        <w:spacing w:after="80" w:line="300" w:lineRule="auto"/>
-        <w:ind w:left="540" w:hanging="271"/>
-        <w:numPr>
-          <w:ilvl w:val="0"/>
-          <w:numId w:val="30"/>
-        </w:numPr>
-      </w:pPr>
-      <w:r>
-        <w:t>동영상: JSON 계약만 존재하며 전용 Provider가 없으면 사용 불가</w:t>
-      </w:r>
+        <w:t>접근 권한이 바뀌어 볼 수 없게 된 근거의 답변은 내용 대신 "표시할 수 없습니다"로 보입니다.</w:t>
+      </w:r>
+    </w:p>
+    <w:p>
+      <w:bookmarkStart w:id="47" w:name="toc_47"/>
+      <w:pPr>
+        <w:pStyle w:val="Heading2"/>
+      </w:pPr>
+      <w:r>
+        <w:t>10.6 모델과 추론 수준 선택</w:t>
+      </w:r>
+      <w:bookmarkEnd w:id="47"/>
     </w:p>
     <w:p>
       <w:pPr>
         <w:widowControl/>
       </w:pPr>
       <w:r>
-        <w:t>산출물별 형식은 현재 서버와 조직 정책에 따라 더 제한될 수 있습니다.</w:t>
-      </w:r>
-    </w:p>
-    <w:p>
-      <w:bookmarkStart w:id="49" w:name="toc_49"/>
-      <w:pPr>
-        <w:pStyle w:val="Heading2"/>
-      </w:pPr>
-      <w:r>
-        <w:t>12.2 생성 설정</w:t>
-      </w:r>
-      <w:bookmarkEnd w:id="49"/>
-    </w:p>
-    <w:p>
-      <w:pPr>
-        <w:widowControl/>
-      </w:pPr>
-      <w:r>
-        <w:t>필수 설정은 목적, 독자, 언어, Source Version, 분량, 구성, 출력 형식과 검토 조건입니다. 조직 정책으로 잠긴 값은 Workspace 화면에서 변경할 수 없습니다.</w:t>
+        <w:t>입력창 오른쪽 아래의 두 선택 상자에서 이 노트북의 질문에 쓸 모델과 추론 수준을 고릅니다.</w:t>
       </w:r>
     </w:p>
     <w:p>
@@ -3058,7 +2960,7 @@
         </w:numPr>
       </w:pPr>
       <w:r>
-        <w:t>산출물 유형을 선택합니다.</w:t>
+        <w:t>모델: 승인된 Provider의 정확한 모델이 연결 이름 · 모델 ID로 보입니다. 기본 모델은 Workspace 기본 모델입니다.</w:t>
       </w:r>
     </w:p>
     <w:p>
@@ -3071,82 +2973,23 @@
         </w:numPr>
       </w:pPr>
       <w:r>
-        <w:t>필수 설정을 입력합니다.</w:t>
-      </w:r>
-    </w:p>
-    <w:p>
-      <w:pPr>
-        <w:spacing w:after="80" w:line="300" w:lineRule="auto"/>
-        <w:ind w:left="540" w:hanging="271"/>
-        <w:numPr>
-          <w:ilvl w:val="0"/>
-          <w:numId w:val="31"/>
-        </w:numPr>
-      </w:pPr>
-      <w:r>
-        <w:t>설정 확인을 선택합니다.</w:t>
-      </w:r>
-    </w:p>
-    <w:p>
-      <w:pPr>
-        <w:spacing w:after="80" w:line="300" w:lineRule="auto"/>
-        <w:ind w:left="540" w:hanging="271"/>
-        <w:numPr>
-          <w:ilvl w:val="0"/>
-          <w:numId w:val="31"/>
-        </w:numPr>
-      </w:pPr>
-      <w:r>
-        <w:t>현재 모델과 정책 요약을 확인합니다.</w:t>
-      </w:r>
-    </w:p>
-    <w:p>
-      <w:pPr>
-        <w:spacing w:after="80" w:line="300" w:lineRule="auto"/>
-        <w:ind w:left="540" w:hanging="271"/>
-        <w:numPr>
-          <w:ilvl w:val="0"/>
-          <w:numId w:val="31"/>
-        </w:numPr>
-      </w:pPr>
-      <w:r>
-        <w:t>생성을 선택합니다.</w:t>
-      </w:r>
-    </w:p>
-    <w:p>
-      <w:bookmarkStart w:id="50" w:name="toc_50"/>
-      <w:pPr>
-        <w:pStyle w:val="Heading2"/>
-      </w:pPr>
-      <w:r>
-        <w:t>12.3 Library와 상태</w:t>
-      </w:r>
-      <w:bookmarkEnd w:id="50"/>
+        <w:t>추론 수준: 모델 기본(수준을 보내지 않음) 또는 낮음·보통·높음(모델에 따라 없음). 모델이 지원하는 수준만 선택할 수 있고, 확인 전인 수준은 (확인 전)으로 비활성입니다.</w:t>
+      </w:r>
     </w:p>
     <w:p>
       <w:pPr>
         <w:widowControl/>
       </w:pPr>
       <w:r>
-        <w:t>생성 결과는 Library에 저장됩니다. 대표 상태는 초안, 생성 중, 검토 중, 수정 필요, 승인됨, 전달됨, 생성 실패, 사용 불가입니다.</w:t>
-      </w:r>
-    </w:p>
-    <w:p>
-      <w:bookmarkStart w:id="51" w:name="toc_51"/>
-      <w:pPr>
-        <w:pStyle w:val="Heading2"/>
-      </w:pPr>
-      <w:r>
-        <w:t>12.4 Version 만들기</w:t>
-      </w:r>
-      <w:bookmarkEnd w:id="51"/>
+        <w:t xml:space="preserve">   - 라우터 연결(OmniRoute, Eoul Gateway, OpenRouter, Media Bridge)은 항상 낮음·보통·높음 3종입니다. 라우터가 내부에서 실제 모델에 맞게 변환합니다.</w:t>
+      </w:r>
     </w:p>
     <w:p>
       <w:pPr>
         <w:widowControl/>
       </w:pPr>
       <w:r>
-        <w:t>기존 Version을 직접 덮어쓰지 않습니다. 변경 이유와 내용을 입력한 뒤 다음 중 하나를 선택합니다.</w:t>
+        <w:t xml:space="preserve">   - 그 밖의 모델은 처음 선택하는 순간 Daon이 수준마다 아주 작은 요청을 보내 받아 주는 수준만 열어 줍니다(잠시 "확인하는 중…"). 이때 사용료가 조금 발생할 수 있습니다.</w:t>
       </w:r>
     </w:p>
     <w:p>
@@ -3159,7 +3002,7 @@
         </w:numPr>
       </w:pPr>
       <w:r>
-        <w:t>편집 새 Version: 사용자가 직접 수정한 Version</w:t>
+        <w:t>선택은 사용자·노트북별로 저장되어 다시 열어도 유지되고, 실제 질문 호출에 적용됩니다.</w:t>
       </w:r>
     </w:p>
     <w:p>
@@ -3172,7 +3015,7 @@
         </w:numPr>
       </w:pPr>
       <w:r>
-        <w:t>AI 재생성 새 Version: AI로 다시 생성한 Version</w:t>
+        <w:t>고른 모델이 막히거나 실패해도 기본 모델이나 다른 계정으로 바꿔 다시 시도하지 않습니다. 오류를 확인한 뒤 직접 고릅니다.</w:t>
       </w:r>
     </w:p>
     <w:p>
@@ -3185,18 +3028,26 @@
         </w:numPr>
       </w:pPr>
       <w:r>
-        <w:t>설정 변경 새 Version: 생성 설정 변경을 반영한 Version</w:t>
-      </w:r>
-    </w:p>
-    <w:p>
-      <w:bookmarkStart w:id="52" w:name="toc_52"/>
-      <w:pPr>
-        <w:pStyle w:val="Heading2"/>
-      </w:pPr>
-      <w:r>
-        <w:t>12.5 검토와 승인</w:t>
-      </w:r>
-      <w:bookmarkEnd w:id="52"/>
+        <w:t>선택은 대화(질문)에만 적용됩니다. Studio 생성은 Workspace 기본 모델을 씁니다.</w:t>
+      </w:r>
+    </w:p>
+    <w:p>
+      <w:bookmarkStart w:id="48" w:name="toc_48"/>
+      <w:pPr>
+        <w:pStyle w:val="Heading1"/>
+      </w:pPr>
+      <w:r>
+        <w:t>11. Citation 검토</w:t>
+      </w:r>
+      <w:bookmarkEnd w:id="48"/>
+    </w:p>
+    <w:p>
+      <w:pPr>
+        <w:widowControl/>
+      </w:pPr>
+      <w:r>
+        <w:t>Citation은 답변이 참조한 근거 위치입니다.</w:t>
+      </w:r>
     </w:p>
     <w:p>
       <w:pPr>
@@ -3208,7 +3059,7 @@
         </w:numPr>
       </w:pPr>
       <w:r>
-        <w:t>작성자가 검토 요청을 선택합니다.</w:t>
+        <w:t>답변마다 Citation이 있는지 확인합니다.</w:t>
       </w:r>
     </w:p>
     <w:p>
@@ -3221,7 +3072,7 @@
         </w:numPr>
       </w:pPr>
       <w:r>
-        <w:t>검토자가 내용과 Citation을 확인합니다.</w:t>
+        <w:t>PDF이면 표시된 페이지를 엽니다.</w:t>
       </w:r>
     </w:p>
     <w:p>
@@ -3234,7 +3085,7 @@
         </w:numPr>
       </w:pPr>
       <w:r>
-        <w:t>필요한 경우 수정 의견을 남깁니다.</w:t>
+        <w:t>Daon 지식이면 지식 origin과 위치를 확인합니다.</w:t>
       </w:r>
     </w:p>
     <w:p>
@@ -3247,7 +3098,7 @@
         </w:numPr>
       </w:pPr>
       <w:r>
-        <w:t>작성자 또는 검토자가 승인 요청을 선택합니다.</w:t>
+        <w:t>원문 문장과 답변 해석을 비교합니다.</w:t>
       </w:r>
     </w:p>
     <w:p>
@@ -3260,7 +3111,20 @@
         </w:numPr>
       </w:pPr>
       <w:r>
-        <w:t>승인자가 승인 또는 수정 요청을 선택합니다.</w:t>
+        <w:t>질문에 선택하지 않은 Source가 섞이지 않았는지 확인합니다.</w:t>
+      </w:r>
+    </w:p>
+    <w:p>
+      <w:pPr>
+        <w:spacing w:after="80" w:line="300" w:lineRule="auto"/>
+        <w:ind w:left="540" w:hanging="271"/>
+        <w:numPr>
+          <w:ilvl w:val="0"/>
+          <w:numId w:val="33"/>
+        </w:numPr>
+      </w:pPr>
+      <w:r>
+        <w:t>Citation이 없거나 불충분하면 결과를 승인하지 않습니다.</w:t>
       </w:r>
     </w:p>
     <w:p>
@@ -3268,44 +3132,28 @@
         <w:widowControl/>
       </w:pPr>
       <w:r>
-        <w:t>권한이 없거나 승인 요청이 만들어지지 않은 상태에서는 버튼이 비활성화됩니다.</w:t>
-      </w:r>
-    </w:p>
-    <w:p>
-      <w:bookmarkStart w:id="53" w:name="toc_53"/>
+        <w:t>현재 Citation 화면은 페이지 또는 지식 위치 중심입니다. Source 이름, Version과 처리 상태는 Source 패널과 함께 대조합니다.</w:t>
+      </w:r>
+    </w:p>
+    <w:p>
+      <w:bookmarkStart w:id="49" w:name="toc_49"/>
+      <w:pPr>
+        <w:pStyle w:val="Heading1"/>
+      </w:pPr>
+      <w:r>
+        <w:t>12. 업무 Studio</w:t>
+      </w:r>
+      <w:bookmarkEnd w:id="49"/>
+    </w:p>
+    <w:p>
+      <w:bookmarkStart w:id="50" w:name="toc_50"/>
       <w:pPr>
         <w:pStyle w:val="Heading2"/>
       </w:pPr>
       <w:r>
-        <w:t>12.6 내보내기·전달·생산 지식 등록</w:t>
-      </w:r>
-      <w:bookmarkEnd w:id="53"/>
-    </w:p>
-    <w:p>
-      <w:pPr>
-        <w:widowControl/>
-      </w:pPr>
-      <w:r>
-        <w:t>승인된 산출물만 내보내기와 전달을 사용할 수 있습니다. 생산 지식 등록은 자동이 아니며 사용자가 명시적으로 선택해야 합니다. 전달 대상과 조직 정책을 확인한 뒤 실행합니다.</w:t>
-      </w:r>
-    </w:p>
-    <w:p>
-      <w:bookmarkStart w:id="54" w:name="toc_54"/>
-      <w:pPr>
-        <w:pStyle w:val="Heading1"/>
-      </w:pPr>
-      <w:r>
-        <w:t>13. LLM 설정</w:t>
-      </w:r>
-      <w:bookmarkEnd w:id="54"/>
-    </w:p>
-    <w:p>
-      <w:pPr>
-        <w:widowControl/>
-      </w:pPr>
-      <w:r>
-        <w:t>로그인 후 Notebook 홈의 설정 → LLM 설정에서 시스템 Provider 연결과 현재 Workspace 기본 모델을 확인합니다. 화면 상단에는 현재 접속한 사용자 ID와 시스템 관리자 여부가 표시됩니다.</w:t>
-      </w:r>
+        <w:t>12.1 산출물 유형과 형식</w:t>
+      </w:r>
+      <w:bookmarkEnd w:id="50"/>
     </w:p>
     <w:p>
       <w:pPr>
@@ -3317,7 +3165,7 @@
         </w:numPr>
       </w:pPr>
       <w:r>
-        <w:t>시스템 관리자는 연결의 Endpoint, 호환 방식, 이름·약어, 허용 모델과 공용 사용 여부를 관리합니다.</w:t>
+        <w:t>근거 기반 보고서: DOCX, PDF</w:t>
       </w:r>
     </w:p>
     <w:p>
@@ -3330,7 +3178,7 @@
         </w:numPr>
       </w:pPr>
       <w:r>
-        <w:t>일반 사용자는 등록된 연결을 조회하고, 비공용 연결에는 본인 계정의 개인 Key를 등록합니다. Endpoint와 허용 모델을 임의로 변경하지 않습니다.</w:t>
+        <w:t>제약·준수 점검표: XLSX, CSV, PDF</w:t>
       </w:r>
     </w:p>
     <w:p>
@@ -3343,7 +3191,7 @@
         </w:numPr>
       </w:pPr>
       <w:r>
-        <w:t>공용 연결은 관리자 Key를 사용하고 비공용 연결은 본인 계정의 개인 Key를 사용합니다. 비공용 연결에 개인 Key가 없을 때 시스템 Key로 fallback하는 경로는 없습니다.</w:t>
+        <w:t>비교·데이터 표: XLSX, CSV, PDF</w:t>
       </w:r>
     </w:p>
     <w:p>
@@ -3356,25 +3204,188 @@
         </w:numPr>
       </w:pPr>
       <w:r>
-        <w:t>Credential 원문은 다시 표시되지 않습니다. 연결 확인, 모델 카탈로그 조회, 질문 실행과 Studio 저장은 서로 다른 검증 단계입니다. 준비 중 표시는 실제 실행 준비 완료를 뜻하지 않습니다.</w:t>
-      </w:r>
-    </w:p>
-    <w:p>
-      <w:bookmarkStart w:id="55" w:name="toc_55"/>
+        <w:t>지식 구조도: JSON, SVG, PNG, PDF</w:t>
+      </w:r>
+    </w:p>
+    <w:p>
+      <w:pPr>
+        <w:spacing w:after="80" w:line="300" w:lineRule="auto"/>
+        <w:ind w:left="540" w:hanging="271"/>
+        <w:numPr>
+          <w:ilvl w:val="0"/>
+          <w:numId w:val="34"/>
+        </w:numPr>
+      </w:pPr>
+      <w:r>
+        <w:t>업무 문서 초안: DOCX, PDF</w:t>
+      </w:r>
+    </w:p>
+    <w:p>
+      <w:pPr>
+        <w:spacing w:after="80" w:line="300" w:lineRule="auto"/>
+        <w:ind w:left="540" w:hanging="271"/>
+        <w:numPr>
+          <w:ilvl w:val="0"/>
+          <w:numId w:val="34"/>
+        </w:numPr>
+      </w:pPr>
+      <w:r>
+        <w:t>슬라이드: PDF, JSON</w:t>
+      </w:r>
+    </w:p>
+    <w:p>
+      <w:pPr>
+        <w:spacing w:after="80" w:line="300" w:lineRule="auto"/>
+        <w:ind w:left="540" w:hanging="271"/>
+        <w:numPr>
+          <w:ilvl w:val="0"/>
+          <w:numId w:val="34"/>
+        </w:numPr>
+      </w:pPr>
+      <w:r>
+        <w:t>인포그래픽: SVG, PNG, PDF, JSON</w:t>
+      </w:r>
+    </w:p>
+    <w:p>
+      <w:pPr>
+        <w:spacing w:after="80" w:line="300" w:lineRule="auto"/>
+        <w:ind w:left="540" w:hanging="271"/>
+        <w:numPr>
+          <w:ilvl w:val="0"/>
+          <w:numId w:val="34"/>
+        </w:numPr>
+      </w:pPr>
+      <w:r>
+        <w:t>플래시카드: JSON, CSV, PDF</w:t>
+      </w:r>
+    </w:p>
+    <w:p>
+      <w:pPr>
+        <w:spacing w:after="80" w:line="300" w:lineRule="auto"/>
+        <w:ind w:left="540" w:hanging="271"/>
+        <w:numPr>
+          <w:ilvl w:val="0"/>
+          <w:numId w:val="34"/>
+        </w:numPr>
+      </w:pPr>
+      <w:r>
+        <w:t>퀴즈: JSON, CSV, PDF</w:t>
+      </w:r>
+    </w:p>
+    <w:p>
+      <w:pPr>
+        <w:spacing w:after="80" w:line="300" w:lineRule="auto"/>
+        <w:ind w:left="540" w:hanging="271"/>
+        <w:numPr>
+          <w:ilvl w:val="0"/>
+          <w:numId w:val="34"/>
+        </w:numPr>
+      </w:pPr>
+      <w:r>
+        <w:t>AI 오디오: JSON 계약만 존재하며 전용 Provider가 없으면 사용 불가</w:t>
+      </w:r>
+    </w:p>
+    <w:p>
+      <w:pPr>
+        <w:spacing w:after="80" w:line="300" w:lineRule="auto"/>
+        <w:ind w:left="540" w:hanging="271"/>
+        <w:numPr>
+          <w:ilvl w:val="0"/>
+          <w:numId w:val="34"/>
+        </w:numPr>
+      </w:pPr>
+      <w:r>
+        <w:t>동영상: JSON 계약만 존재하며 전용 Provider가 없으면 사용 불가</w:t>
+      </w:r>
+    </w:p>
+    <w:p>
+      <w:pPr>
+        <w:widowControl/>
+      </w:pPr>
+      <w:r>
+        <w:t>산출물별 형식은 현재 서버와 조직 정책에 따라 더 제한될 수 있습니다.</w:t>
+      </w:r>
+    </w:p>
+    <w:p>
+      <w:pPr>
+        <w:widowControl/>
+      </w:pPr>
+      <w:r>
+        <w:t>산출물은 선택한 유형의 구조를 따릅니다. 미리보기, 저장, 다운로드가 같은 구조를 유지합니다.</w:t>
+      </w:r>
+    </w:p>
+    <w:p>
+      <w:pPr>
+        <w:widowControl/>
+      </w:pPr>
+      <w:r>
+        <w:t>| 유형 | 구조 |</w:t>
+      </w:r>
+    </w:p>
+    <w:p>
+      <w:pPr>
+        <w:widowControl/>
+      </w:pPr>
+      <w:r>
+        <w:t>| --- | --- |</w:t>
+      </w:r>
+    </w:p>
+    <w:p>
+      <w:pPr>
+        <w:widowControl/>
+      </w:pPr>
+      <w:r>
+        <w:t>| 데이터 표(비교표) | 첫 열은 비교 대상, 나머지 열은 비교 기준입니다. 대상은 2개 이상, 기준은 2개 이상이며, 소스에 없는 칸은 소스에 없음으로 표시합니다. |</w:t>
+      </w:r>
+    </w:p>
+    <w:p>
+      <w:pPr>
+        <w:widowControl/>
+      </w:pPr>
+      <w:r>
+        <w:t>| 슬라이드 | 표지 다음부터 챕터(주제) 하나가 한 장이고 챕터 제목과 핵심 내용이 있습니다. |</w:t>
+      </w:r>
+    </w:p>
+    <w:p>
+      <w:pPr>
+        <w:widowControl/>
+      </w:pPr>
+      <w:r>
+        <w:t>| 플래시카드 | 개념 하나에 질문(앞면)과 답(뒷면)입니다. |</w:t>
+      </w:r>
+    </w:p>
+    <w:p>
+      <w:pPr>
+        <w:widowControl/>
+      </w:pPr>
+      <w:r>
+        <w:t>| 퀴즈 | 문제, 보기 4개, 정답, 해설을 모두 갖춘 문항만 만들어집니다. |</w:t>
+      </w:r>
+    </w:p>
+    <w:p>
+      <w:pPr>
+        <w:widowControl/>
+      </w:pPr>
+      <w:r>
+        <w:t>구조를 채우지 못하면 한 번 더 시도하고, 그래도 안 되면 설정을 바꿔 다시 생성하도록 안내합니다.</w:t>
+      </w:r>
+    </w:p>
+    <w:p>
+      <w:bookmarkStart w:id="51" w:name="toc_51"/>
       <w:pPr>
         <w:pStyle w:val="Heading2"/>
       </w:pPr>
       <w:r>
-        <w:t>13.1 시스템 Provider 연결 추가</w:t>
-      </w:r>
-      <w:bookmarkEnd w:id="55"/>
+        <w:t>12.2 생성 설정</w:t>
+      </w:r>
+      <w:bookmarkEnd w:id="51"/>
     </w:p>
     <w:p>
       <w:pPr>
         <w:widowControl/>
       </w:pPr>
       <w:r>
-        <w:t>시스템 관리자로 로그인한 뒤 다음 순서로 진행합니다.</w:t>
+        <w:t>필수 설정은 목적, 독자, 언어, Source Version, 분량, 구성, 출력 형식과 검토 조건입니다. 조직 정책으로 잠긴 값은 Workspace 화면에서 변경할 수 없습니다.</w:t>
       </w:r>
     </w:p>
     <w:p>
@@ -3387,7 +3398,7 @@
         </w:numPr>
       </w:pPr>
       <w:r>
-        <w:t>설정 → LLM 설정의 시스템 Provider 연결에서 연결 추가를 선택합니다.</w:t>
+        <w:t>산출물 유형을 선택합니다.</w:t>
       </w:r>
     </w:p>
     <w:p>
@@ -3400,7 +3411,7 @@
         </w:numPr>
       </w:pPr>
       <w:r>
-        <w:t>OpenAI 호환은 Chat Completions, Anthropic 호환은 Messages 규격에 맞는 연결을 선택합니다. 이 호환 연결은 내부적으로 CUSTOM으로 구분됩니다.</w:t>
+        <w:t>필수 설정을 입력합니다.</w:t>
       </w:r>
     </w:p>
     <w:p>
@@ -3413,7 +3424,7 @@
         </w:numPr>
       </w:pPr>
       <w:r>
-        <w:t>Provider 표시 이름, 연결 이름, 두 글자 약어와 서버에서 접근 가능한 검증된 Endpoint를 입력합니다. 저장된 연결 ID는 연결을 구분하는 고정 식별자입니다.</w:t>
+        <w:t>설정 확인을 선택합니다.</w:t>
       </w:r>
     </w:p>
     <w:p>
@@ -3426,7 +3437,7 @@
         </w:numPr>
       </w:pPr>
       <w:r>
-        <w:t>인증 유형과 공용 사용 여부를 확인하고 필요한 Key를 입력합니다. 비공용 연결의 관리자 시험용 Key가 모든 사용자용 Key로 저장된다고 가정하지 않습니다.</w:t>
+        <w:t>현재 모델과 정책 요약을 확인합니다.</w:t>
       </w:r>
     </w:p>
     <w:p>
@@ -3439,80 +3450,43 @@
         </w:numPr>
       </w:pPr>
       <w:r>
-        <w:t>모델 목록 조회 결과를 확인합니다. 자동 조회가 지원되지 않으면 실제 Provider의 모델 ID를 직접 입력합니다. 조회된 모델 전체가 자동으로 허용되는 것은 아닙니다.</w:t>
-      </w:r>
-    </w:p>
-    <w:p>
-      <w:pPr>
-        <w:spacing w:after="80" w:line="300" w:lineRule="auto"/>
-        <w:ind w:left="540" w:hanging="271"/>
-        <w:numPr>
-          <w:ilvl w:val="0"/>
-          <w:numId w:val="35"/>
-        </w:numPr>
-      </w:pPr>
-      <w:r>
-        <w:t>허용할 모델을 최대 4개 선택합니다. 모델 목록이 비어 있으면 질문 실행 준비가 끝난 것으로 판단하지 않습니다.</w:t>
-      </w:r>
-    </w:p>
-    <w:p>
-      <w:pPr>
-        <w:spacing w:after="80" w:line="300" w:lineRule="auto"/>
-        <w:ind w:left="540" w:hanging="271"/>
-        <w:numPr>
-          <w:ilvl w:val="0"/>
-          <w:numId w:val="35"/>
-        </w:numPr>
-      </w:pPr>
-      <w:r>
-        <w:t>사용 후보 포함 여부를 확인하고 연결 시험 및 저장을 선택합니다. 연결 시험에도 실제 짧은 Provider 요청과 비용이 발생할 수 있습니다.</w:t>
-      </w:r>
-    </w:p>
-    <w:p>
-      <w:pPr>
-        <w:spacing w:after="80" w:line="300" w:lineRule="auto"/>
-        <w:ind w:left="540" w:hanging="271"/>
-        <w:numPr>
-          <w:ilvl w:val="0"/>
-          <w:numId w:val="35"/>
-        </w:numPr>
-      </w:pPr>
-      <w:r>
-        <w:t>저장 후 연결 상태와 모델 목록을 다시 확인합니다. 사용 대기 연결 등록은 확인되지 않은 연결을 등록하는 동작이지 실행 성공이 아닙니다.</w:t>
-      </w:r>
+        <w:t>생성을 선택합니다.</w:t>
+      </w:r>
+    </w:p>
+    <w:p>
+      <w:bookmarkStart w:id="52" w:name="toc_52"/>
+      <w:pPr>
+        <w:pStyle w:val="Heading2"/>
+      </w:pPr>
+      <w:r>
+        <w:t>12.3 Library와 상태</w:t>
+      </w:r>
+      <w:bookmarkEnd w:id="52"/>
     </w:p>
     <w:p>
       <w:pPr>
         <w:widowControl/>
       </w:pPr>
       <w:r>
-        <w:t>현재 질문·일반 대화 경로에는 Ollama, Groq, Mistral, Upstage, OpenRouter, OmniRoute, Eoul Gateway와 지원되는 CUSTOM Adapter가 연결되어 있습니다. Media Bridge는 CUSTOM의 OpenAI 호환 연결로 등록합니다. OpenAI·Anthropic 서비스의 호환 연결 지원과 과거 같은 이름의 Provider 코드가 실행 가능한지는 구분해야 합니다. 다른 코드나 미지원 Adapter를 카드에 표시할 수 있다는 이유만으로 실행 가능하다고 판단하지 않습니다.</w:t>
-      </w:r>
+        <w:t>생성 결과는 Library에 저장됩니다. 대표 상태는 초안, 생성 중, 검토 중, 수정 필요, 승인됨, 전달됨, 생성 실패, 사용 불가입니다.</w:t>
+      </w:r>
+    </w:p>
+    <w:p>
+      <w:bookmarkStart w:id="53" w:name="toc_53"/>
+      <w:pPr>
+        <w:pStyle w:val="Heading2"/>
+      </w:pPr>
+      <w:r>
+        <w:t>12.4 Version 만들기</w:t>
+      </w:r>
+      <w:bookmarkEnd w:id="53"/>
     </w:p>
     <w:p>
       <w:pPr>
         <w:widowControl/>
       </w:pPr>
       <w:r>
-        <w:t>Provider 설정 화면의 현재 키 저장 절차에 없는 비밀번호 입력을 임의로 추가하지 않습니다. 외부 전송·승인 등 다른 민감 작업에서 요구하는 정식 추가 인증은 별도로 수행합니다. 키나 Provider 응답 원문을 화면 캡처·로그·문의 글에 붙여 넣지 않습니다.</w:t>
-      </w:r>
-    </w:p>
-    <w:p>
-      <w:bookmarkStart w:id="56" w:name="toc_56"/>
-      <w:pPr>
-        <w:pStyle w:val="Heading2"/>
-      </w:pPr>
-      <w:r>
-        <w:t>13.2 Ollama Endpoint 여러 개 등록</w:t>
-      </w:r>
-      <w:bookmarkEnd w:id="56"/>
-    </w:p>
-    <w:p>
-      <w:pPr>
-        <w:widowControl/>
-      </w:pPr>
-      <w:r>
-        <w:t>Ollama는 Endpoint마다 별도 연결 이름을 부여해 동시에 등록합니다. 사내 연결과 승인된 Gateway 연결 등 실제 운영자가 확인한 주소를 사용합니다.</w:t>
+        <w:t>기존 Version을 직접 덮어쓰지 않습니다. 변경 이유와 내용을 입력한 뒤 다음 중 하나를 선택합니다.</w:t>
       </w:r>
     </w:p>
     <w:p>
@@ -3525,7 +3499,7 @@
         </w:numPr>
       </w:pPr>
       <w:r>
-        <w:t>첫 번째 연결을 사내 Ollama처럼 구분 가능한 이름으로 등록합니다.</w:t>
+        <w:t>편집 새 Version: 사용자가 직접 수정한 Version</w:t>
       </w:r>
     </w:p>
     <w:p>
@@ -3538,7 +3512,7 @@
         </w:numPr>
       </w:pPr>
       <w:r>
-        <w:t>두 번째 연결은 다른 이름과 Endpoint로 등록합니다.</w:t>
+        <w:t>AI 재생성 새 Version: AI로 다시 생성한 Version</w:t>
       </w:r>
     </w:p>
     <w:p>
@@ -3551,39 +3525,18 @@
         </w:numPr>
       </w:pPr>
       <w:r>
-        <w:t>각 연결에서 실제 설치된 모델이 따로 조회되는지 확인합니다.</w:t>
-      </w:r>
-    </w:p>
-    <w:p>
-      <w:pPr>
-        <w:spacing w:after="80" w:line="300" w:lineRule="auto"/>
-        <w:ind w:left="540" w:hanging="271"/>
-        <w:numPr>
-          <w:ilvl w:val="0"/>
-          <w:numId w:val="36"/>
-        </w:numPr>
-      </w:pPr>
-      <w:r>
-        <w:t>Workspace 기본 모델에서 필요한 연결과 모델 조합을 선택합니다.</w:t>
-      </w:r>
-    </w:p>
-    <w:p>
-      <w:pPr>
-        <w:widowControl/>
-      </w:pPr>
-      <w:r>
-        <w:t>Daon은 Ollama 모델을 자동 설치하거나 삭제하지 않습니다. 사용자 브라우저 주소를 서버 Endpoint로 오인하거나 내부 주소를 임의로 입력해 접근 제한을 우회하지 않습니다.</w:t>
-      </w:r>
-    </w:p>
-    <w:p>
-      <w:bookmarkStart w:id="57" w:name="toc_57"/>
+        <w:t>설정 변경 새 Version: 생성 설정 변경을 반영한 Version</w:t>
+      </w:r>
+    </w:p>
+    <w:p>
+      <w:bookmarkStart w:id="54" w:name="toc_54"/>
       <w:pPr>
         <w:pStyle w:val="Heading2"/>
       </w:pPr>
       <w:r>
-        <w:t>13.3 OpenRouter·OmniRoute·Eoul Gateway·Media Bridge</w:t>
-      </w:r>
-      <w:bookmarkEnd w:id="57"/>
+        <w:t>12.5 검토와 승인</w:t>
+      </w:r>
+      <w:bookmarkEnd w:id="54"/>
     </w:p>
     <w:p>
       <w:pPr>
@@ -3595,7 +3548,7 @@
         </w:numPr>
       </w:pPr>
       <w:r>
-        <w:t>OpenRouter는 실제 API Endpoint와 Key를 사용합니다.</w:t>
+        <w:t>작성자가 검토 요청을 선택합니다.</w:t>
       </w:r>
     </w:p>
     <w:p>
@@ -3608,7 +3561,7 @@
         </w:numPr>
       </w:pPr>
       <w:r>
-        <w:t>OmniRoute와 Eoul Gateway는 Gateway의 API Endpoint, Client Key와 실제 모델 ID를 사용합니다.</w:t>
+        <w:t>검토자가 내용과 Citation을 확인합니다.</w:t>
       </w:r>
     </w:p>
     <w:p>
@@ -3621,7 +3574,7 @@
         </w:numPr>
       </w:pPr>
       <w:r>
-        <w:t>Media Bridge는 CUSTOM의 OpenAI 호환 방식으로 실제 API Endpoint와 모델 ID를 등록합니다.</w:t>
+        <w:t>필요한 경우 수정 의견을 남깁니다.</w:t>
       </w:r>
     </w:p>
     <w:p>
@@ -3634,7 +3587,20 @@
         </w:numPr>
       </w:pPr>
       <w:r>
-        <w:t>설치형·별도 배포형 모두 Daon User 서버에서 실제 접근 가능한 API Endpoint를 사용합니다. Console 화면 주소와 API Endpoint를 혼동하지 않습니다.</w:t>
+        <w:t>작성자 또는 검토자가 승인 요청을 선택합니다.</w:t>
+      </w:r>
+    </w:p>
+    <w:p>
+      <w:pPr>
+        <w:spacing w:after="80" w:line="300" w:lineRule="auto"/>
+        <w:ind w:left="540" w:hanging="271"/>
+        <w:numPr>
+          <w:ilvl w:val="0"/>
+          <w:numId w:val="37"/>
+        </w:numPr>
+      </w:pPr>
+      <w:r>
+        <w:t>승인자가 승인 또는 수정 요청을 선택합니다.</w:t>
       </w:r>
     </w:p>
     <w:p>
@@ -3642,26 +3608,44 @@
         <w:widowControl/>
       </w:pPr>
       <w:r>
-        <w:t>라우터의 Auto는 모델 목록에서 선택하는 하나의 모델입니다. OmniRoute는 auto, OpenRouter는 openrouter/auto를 사용합니다. OpenAI 호환 연결은 시스템 관리자가 라우터 Auto 사용을 켜고 실제 Auto 모델 ID를 지정할 수 있습니다. 조회 목록에 없는 Auto에는 논리 모델 표시가 붙습니다. Auto 선택과 모델을 지정하지 않아 Provider의 기준 모델을 사용하는 것은 다릅니다. Combo 자동 선택 기능으로 설명하지 않습니다.</w:t>
-      </w:r>
+        <w:t>권한이 없거나 승인 요청이 만들어지지 않은 상태에서는 버튼이 비활성화됩니다.</w:t>
+      </w:r>
+    </w:p>
+    <w:p>
+      <w:bookmarkStart w:id="55" w:name="toc_55"/>
+      <w:pPr>
+        <w:pStyle w:val="Heading2"/>
+      </w:pPr>
+      <w:r>
+        <w:t>12.6 내보내기·전달·생산 지식 등록</w:t>
+      </w:r>
+      <w:bookmarkEnd w:id="55"/>
     </w:p>
     <w:p>
       <w:pPr>
         <w:widowControl/>
       </w:pPr>
       <w:r>
-        <w:t>하위 Provider 선택·우선순위·Fallback은 Gateway가 책임집니다. Daon User는 선택한 하나의 논리 모델을 호출하며 Gateway 내부 라우팅을 중복 구현하지 않습니다.</w:t>
-      </w:r>
-    </w:p>
-    <w:p>
-      <w:bookmarkStart w:id="58" w:name="toc_58"/>
-      <w:pPr>
-        <w:pStyle w:val="Heading2"/>
-      </w:pPr>
-      <w:r>
-        <w:t>13.4 Workspace 기본 모델 선택</w:t>
-      </w:r>
-      <w:bookmarkEnd w:id="58"/>
+        <w:t>승인된 산출물만 내보내기와 전달을 사용할 수 있습니다. 생산 지식 등록은 자동이 아니며 사용자가 명시적으로 선택해야 합니다. 전달 대상과 조직 정책을 확인한 뒤 실행합니다.</w:t>
+      </w:r>
+    </w:p>
+    <w:p>
+      <w:bookmarkStart w:id="56" w:name="toc_56"/>
+      <w:pPr>
+        <w:pStyle w:val="Heading1"/>
+      </w:pPr>
+      <w:r>
+        <w:t>13. LLM 설정</w:t>
+      </w:r>
+      <w:bookmarkEnd w:id="56"/>
+    </w:p>
+    <w:p>
+      <w:pPr>
+        <w:widowControl/>
+      </w:pPr>
+      <w:r>
+        <w:t>로그인 후 Notebook 홈의 설정 → LLM 설정에서 시스템 Provider 연결과 현재 Workspace 기본 모델을 확인합니다. 화면 상단에는 현재 접속한 사용자 ID와 시스템 관리자 여부가 표시됩니다.</w:t>
+      </w:r>
     </w:p>
     <w:p>
       <w:pPr>
@@ -3673,7 +3657,7 @@
         </w:numPr>
       </w:pPr>
       <w:r>
-        <w:t>현재 화면의 Workspace 기본 모델에서 텍스트 생성 항목을 확인합니다.</w:t>
+        <w:t>시스템 관리자는 연결의 Endpoint, 호환 방식, 이름·약어, 허용 모델과 공용 사용 여부를 관리합니다.</w:t>
       </w:r>
     </w:p>
     <w:p>
@@ -3686,7 +3670,7 @@
         </w:numPr>
       </w:pPr>
       <w:r>
-        <w:t>연결 이름 · 모델 ID 형식의 항목을 선택합니다.</w:t>
+        <w:t>일반 사용자는 등록된 연결을 조회하고, 비공용 연결에는 본인 계정의 개인 Key를 등록합니다. Endpoint와 허용 모델을 임의로 변경하지 않습니다.</w:t>
       </w:r>
     </w:p>
     <w:p>
@@ -3699,7 +3683,7 @@
         </w:numPr>
       </w:pPr>
       <w:r>
-        <w:t>기본 모델 저장을 선택합니다.</w:t>
+        <w:t>공용 연결은 관리자 Key를 사용하고 비공용 연결은 본인 계정의 개인 Key를 사용합니다. 비공용 연결에 개인 Key가 없을 때 시스템 Key로 fallback하는 경로는 없습니다.</w:t>
       </w:r>
     </w:p>
     <w:p>
@@ -3712,26 +3696,26 @@
         </w:numPr>
       </w:pPr>
       <w:r>
-        <w:t>저장 완료 후 선택이 유지되는지 확인합니다. 실제 질문 성공은 별도의 허용된 새 Run으로 확인합니다.</w:t>
-      </w:r>
+        <w:t>Credential 원문은 다시 표시되지 않습니다. 연결 확인, 모델 카탈로그 조회, 질문 실행과 Studio 저장은 서로 다른 검증 단계입니다. 준비 중 표시는 실제 실행 준비 완료를 뜻하지 않습니다.</w:t>
+      </w:r>
+    </w:p>
+    <w:p>
+      <w:bookmarkStart w:id="57" w:name="toc_57"/>
+      <w:pPr>
+        <w:pStyle w:val="Heading2"/>
+      </w:pPr>
+      <w:r>
+        <w:t>13.1 시스템 Provider 연결 추가</w:t>
+      </w:r>
+      <w:bookmarkEnd w:id="57"/>
     </w:p>
     <w:p>
       <w:pPr>
         <w:widowControl/>
       </w:pPr>
       <w:r>
-        <w:t>모델 카탈로그의 이미지·문서·오디오 등 기능 표시는 이 화면에 모든 기능의 기본값 선택기나 실행 Adapter가 있다는 뜻이 아닙니다. 실행 코드가 없는 기능은 준비 중이며 모델 기능 보정만으로 실행 가능해지지 않습니다. 모델 이름만 보고 실제 지원·품질을 보장하지 않습니다.</w:t>
-      </w:r>
-    </w:p>
-    <w:p>
-      <w:bookmarkStart w:id="59" w:name="toc_59"/>
-      <w:pPr>
-        <w:pStyle w:val="Heading2"/>
-      </w:pPr>
-      <w:r>
-        <w:t>13.5 키 교체·삭제·카탈로그 새로고침</w:t>
-      </w:r>
-      <w:bookmarkEnd w:id="59"/>
+        <w:t>시스템 관리자로 로그인한 뒤 다음 순서로 진행합니다.</w:t>
+      </w:r>
     </w:p>
     <w:p>
       <w:pPr>
@@ -3743,7 +3727,7 @@
         </w:numPr>
       </w:pPr>
       <w:r>
-        <w:t>키 교체: 공용 연결은 권한 있는 관리자가 관리자 Key를, 비공용 연결은 본인이 개인 Key를 교체합니다. 키 교체만 필요한 경우 저장된 Endpoint 재입력이나 worker 재생성은 필요하지 않습니다.</w:t>
+        <w:t>설정 → LLM 설정의 시스템 Provider 연결에서 연결 추가를 선택합니다.</w:t>
       </w:r>
     </w:p>
     <w:p>
@@ -3756,7 +3740,7 @@
         </w:numPr>
       </w:pPr>
       <w:r>
-        <w:t>개인 Key: 내 계정 키 시험 및 저장과 내 계정 키 삭제는 본인 계정 범위입니다. 공용 설정이나 다른 사용자의 Key를 변경하지 않습니다.</w:t>
+        <w:t>OpenAI 호환은 Chat Completions, Anthropic 호환은 Messages 규격에 맞는 연결을 선택합니다. 이 호환 연결은 내부적으로 CUSTOM으로 구분됩니다.</w:t>
       </w:r>
     </w:p>
     <w:p>
@@ -3769,7 +3753,7 @@
         </w:numPr>
       </w:pPr>
       <w:r>
-        <w:t>키 삭제: 연결·카탈로그 삭제와 다른 작업입니다. 필요한 Key가 없으면 해당 사용자의 실행이 차단될 수 있으므로 영향을 확인합니다.</w:t>
+        <w:t>Provider 표시 이름, 연결 이름, 두 글자 약어와 서버에서 접근 가능한 검증된 Endpoint를 입력합니다. 저장된 연결 ID는 연결을 구분하는 고정 식별자입니다.</w:t>
       </w:r>
     </w:p>
     <w:p>
@@ -3782,7 +3766,7 @@
         </w:numPr>
       </w:pPr>
       <w:r>
-        <w:t>카탈로그 새로고침: 모델 목록 조회 후 허용 모델과 현재 Workspace 기본값을 다시 대조합니다. 조회만으로 기본 모델을 임의 교체하지 않습니다.</w:t>
+        <w:t>인증 유형과 공용 사용 여부를 확인하고 필요한 Key를 입력합니다. 비공용 연결의 관리자 시험용 Key가 모든 사용자용 Key로 저장된다고 가정하지 않습니다.</w:t>
       </w:r>
     </w:p>
     <w:p>
@@ -3795,25 +3779,80 @@
         </w:numPr>
       </w:pPr>
       <w:r>
-        <w:t>연결 삭제: 현재 기본값 등에서 참조 중이면 거부될 수 있습니다. 참조를 우회해 삭제하지 않습니다.</w:t>
-      </w:r>
-    </w:p>
-    <w:p>
-      <w:bookmarkStart w:id="60" w:name="toc_60"/>
+        <w:t>모델 목록 조회 결과를 확인합니다. 자동 조회가 지원되지 않으면 실제 Provider의 모델 ID를 직접 입력합니다. 조회된 모델 전체가 자동으로 허용되는 것은 아닙니다.</w:t>
+      </w:r>
+    </w:p>
+    <w:p>
+      <w:pPr>
+        <w:spacing w:after="80" w:line="300" w:lineRule="auto"/>
+        <w:ind w:left="540" w:hanging="271"/>
+        <w:numPr>
+          <w:ilvl w:val="0"/>
+          <w:numId w:val="39"/>
+        </w:numPr>
+      </w:pPr>
+      <w:r>
+        <w:t>허용할 모델을 최대 4개 선택합니다. 모델 목록이 비어 있으면 질문 실행 준비가 끝난 것으로 판단하지 않습니다.</w:t>
+      </w:r>
+    </w:p>
+    <w:p>
+      <w:pPr>
+        <w:spacing w:after="80" w:line="300" w:lineRule="auto"/>
+        <w:ind w:left="540" w:hanging="271"/>
+        <w:numPr>
+          <w:ilvl w:val="0"/>
+          <w:numId w:val="39"/>
+        </w:numPr>
+      </w:pPr>
+      <w:r>
+        <w:t>사용 후보 포함 여부를 확인하고 연결 시험 및 저장을 선택합니다. 연결 시험에도 실제 짧은 Provider 요청과 비용이 발생할 수 있습니다.</w:t>
+      </w:r>
+    </w:p>
+    <w:p>
+      <w:pPr>
+        <w:spacing w:after="80" w:line="300" w:lineRule="auto"/>
+        <w:ind w:left="540" w:hanging="271"/>
+        <w:numPr>
+          <w:ilvl w:val="0"/>
+          <w:numId w:val="39"/>
+        </w:numPr>
+      </w:pPr>
+      <w:r>
+        <w:t>저장 후 연결 상태와 모델 목록을 다시 확인합니다. 사용 대기 연결 등록은 확인되지 않은 연결을 등록하는 동작이지 실행 성공이 아닙니다.</w:t>
+      </w:r>
+    </w:p>
+    <w:p>
+      <w:pPr>
+        <w:widowControl/>
+      </w:pPr>
+      <w:r>
+        <w:t>현재 질문·일반 대화 경로에는 Ollama, Groq, Mistral, Upstage, OpenRouter, OmniRoute, Eoul Gateway와 지원되는 CUSTOM Adapter가 연결되어 있습니다. Media Bridge는 CUSTOM의 OpenAI 호환 연결로 등록합니다. OpenAI·Anthropic 서비스의 호환 연결 지원과 과거 같은 이름의 Provider 코드가 실행 가능한지는 구분해야 합니다. 다른 코드나 미지원 Adapter를 카드에 표시할 수 있다는 이유만으로 실행 가능하다고 판단하지 않습니다.</w:t>
+      </w:r>
+    </w:p>
+    <w:p>
+      <w:pPr>
+        <w:widowControl/>
+      </w:pPr>
+      <w:r>
+        <w:t>Provider 설정 화면의 현재 키 저장 절차에 없는 비밀번호 입력을 임의로 추가하지 않습니다. 외부 전송·승인 등 다른 민감 작업에서 요구하는 정식 추가 인증은 별도로 수행합니다. 키나 Provider 응답 원문을 화면 캡처·로그·문의 글에 붙여 넣지 않습니다.</w:t>
+      </w:r>
+    </w:p>
+    <w:p>
+      <w:bookmarkStart w:id="58" w:name="toc_58"/>
       <w:pPr>
         <w:pStyle w:val="Heading2"/>
       </w:pPr>
       <w:r>
-        <w:t>13.6 기존 환경변수 키 1회 이관(운영자)</w:t>
-      </w:r>
-      <w:bookmarkEnd w:id="60"/>
+        <w:t>13.2 Ollama Endpoint 여러 개 등록</w:t>
+      </w:r>
+      <w:bookmarkEnd w:id="58"/>
     </w:p>
     <w:p>
       <w:pPr>
         <w:widowControl/>
       </w:pPr>
       <w:r>
-        <w:t>이 절차는 이전 배포에서 Provider 키를 환경변수로 사용하던 경우에만 수행합니다. 일반 사용자는 실행하지 않습니다.</w:t>
+        <w:t>Ollama는 Endpoint마다 별도 연결 이름을 부여해 동시에 등록합니다. 사내 연결과 승인된 Gateway 연결 등 실제 운영자가 확인한 주소를 사용합니다.</w:t>
       </w:r>
     </w:p>
     <w:p>
@@ -3826,7 +3865,7 @@
         </w:numPr>
       </w:pPr>
       <w:r>
-        <w:t>비공개 master key 파일이 준비되어 API와 실제 Provider 호출 worker에 read-only Secret으로 제공되는지 확인합니다.</w:t>
+        <w:t>첫 번째 연결을 사내 Ollama처럼 구분 가능한 이름으로 등록합니다.</w:t>
       </w:r>
     </w:p>
     <w:p>
@@ -3839,7 +3878,7 @@
         </w:numPr>
       </w:pPr>
       <w:r>
-        <w:t>DB migration 0040 이후의 기존 Provider 연결과 Credential 저장 구조가 적용되어 있는지 확인합니다.</w:t>
+        <w:t>두 번째 연결은 다른 이름과 Endpoint로 등록합니다.</w:t>
       </w:r>
     </w:p>
     <w:p>
@@ -3852,7 +3891,7 @@
         </w:numPr>
       </w:pPr>
       <w:r>
-        <w:t>기존 키가 서버 환경에 있는 동안 운영용 scripts/import-provider-credentials.py를 실행합니다. 명령에 키 값을 직접 적지 않고 기존 환경변수 이름을 전달합니다.</w:t>
+        <w:t>각 연결에서 실제 설치된 모델이 따로 조회되는지 확인합니다.</w:t>
       </w:r>
     </w:p>
     <w:p>
@@ -3865,70 +3904,26 @@
         </w:numPr>
       </w:pPr>
       <w:r>
-        <w:t>완료 결과의 imported·skipped·unused_provider_types 개수만 기록합니다. 키 원문은 출력하거나 보관하지 않습니다.</w:t>
-      </w:r>
-    </w:p>
-    <w:p>
-      <w:pPr>
-        <w:spacing w:after="80" w:line="300" w:lineRule="auto"/>
-        <w:ind w:left="540" w:hanging="271"/>
-        <w:numPr>
-          <w:ilvl w:val="0"/>
-          <w:numId w:val="40"/>
-        </w:numPr>
-      </w:pPr>
-      <w:r>
-        <w:t>이미 Credential이 있는 연결은 이관으로 덮어쓰지 않습니다. 대응 연결이 없으면 Endpoint를 추측해 새로 만들지 않습니다.</w:t>
-      </w:r>
-    </w:p>
-    <w:p>
-      <w:pPr>
-        <w:spacing w:after="80" w:line="300" w:lineRule="auto"/>
-        <w:ind w:left="540" w:hanging="271"/>
-        <w:numPr>
-          <w:ilvl w:val="0"/>
-          <w:numId w:val="40"/>
-        </w:numPr>
-      </w:pPr>
-      <w:r>
-        <w:t>연결 상태와 실제 사용을 확인한 뒤 이전 키 환경변수와 OLLAMA_BASE_URL 의존을 제거합니다. 런타임의 환경변수 키 fallback으로 사용하지 않습니다.</w:t>
-      </w:r>
-    </w:p>
-    <w:p>
-      <w:bookmarkStart w:id="61" w:name="toc_61"/>
-      <w:pPr>
-        <w:pStyle w:val="Heading1"/>
-      </w:pPr>
-      <w:r>
-        <w:t>14. 출력·버전 설정</w:t>
-      </w:r>
-      <w:bookmarkEnd w:id="61"/>
+        <w:t>Workspace 기본 모델에서 필요한 연결과 모델 조합을 선택합니다.</w:t>
+      </w:r>
     </w:p>
     <w:p>
       <w:pPr>
         <w:widowControl/>
       </w:pPr>
       <w:r>
-        <w:t>산출물 유형별 기본 출력 형식을 선택합니다. 변경한 뒤 저장을 선택합니다. 저장하지 않은 변경이 있는 상태에서 닫으면 저장, 버리기, 계속 편집 중 하나를 선택해야 합니다.</w:t>
-      </w:r>
-    </w:p>
-    <w:p>
-      <w:pPr>
-        <w:widowControl/>
-      </w:pPr>
-      <w:r>
-        <w:t>Version 저장 방식은 append-only입니다. 화면 설정을 바꾸더라도 기존 산출물 Version은 삭제되지 않습니다.</w:t>
-      </w:r>
-    </w:p>
-    <w:p>
-      <w:bookmarkStart w:id="62" w:name="toc_62"/>
-      <w:pPr>
-        <w:pStyle w:val="Heading1"/>
-      </w:pPr>
-      <w:r>
-        <w:t>15. 동기화·승인</w:t>
-      </w:r>
-      <w:bookmarkEnd w:id="62"/>
+        <w:t>Daon은 Ollama 모델을 자동 설치하거나 삭제하지 않습니다. 사용자 브라우저 주소를 서버 Endpoint로 오인하거나 내부 주소를 임의로 입력해 접근 제한을 우회하지 않습니다.</w:t>
+      </w:r>
+    </w:p>
+    <w:p>
+      <w:bookmarkStart w:id="59" w:name="toc_59"/>
+      <w:pPr>
+        <w:pStyle w:val="Heading2"/>
+      </w:pPr>
+      <w:r>
+        <w:t>13.3 OpenRouter·OmniRoute·Eoul Gateway·Media Bridge</w:t>
+      </w:r>
+      <w:bookmarkEnd w:id="59"/>
     </w:p>
     <w:p>
       <w:pPr>
@@ -3940,7 +3935,7 @@
         </w:numPr>
       </w:pPr>
       <w:r>
-        <w:t>설정 → 동기화·승인을 엽니다.</w:t>
+        <w:t>OpenRouter는 실제 API Endpoint와 Key를 사용합니다.</w:t>
       </w:r>
     </w:p>
     <w:p>
@@ -3953,7 +3948,7 @@
         </w:numPr>
       </w:pPr>
       <w:r>
-        <w:t>동기화 Preview에서 대기 항목과 Version을 확인합니다.</w:t>
+        <w:t>OmniRoute와 Eoul Gateway는 Gateway의 API Endpoint, Client Key와 실제 모델 ID를 사용합니다.</w:t>
       </w:r>
     </w:p>
     <w:p>
@@ -3966,7 +3961,7 @@
         </w:numPr>
       </w:pPr>
       <w:r>
-        <w:t>승인할 항목만 체크합니다.</w:t>
+        <w:t>Media Bridge는 CUSTOM의 OpenAI 호환 방식으로 실제 API Endpoint와 모델 ID를 등록합니다.</w:t>
       </w:r>
     </w:p>
     <w:p>
@@ -3979,20 +3974,7 @@
         </w:numPr>
       </w:pPr>
       <w:r>
-        <w:t>현재 비밀번호로 Step-up을 수행합니다.</w:t>
-      </w:r>
-    </w:p>
-    <w:p>
-      <w:pPr>
-        <w:spacing w:after="80" w:line="300" w:lineRule="auto"/>
-        <w:ind w:left="540" w:hanging="271"/>
-        <w:numPr>
-          <w:ilvl w:val="0"/>
-          <w:numId w:val="41"/>
-        </w:numPr>
-      </w:pPr>
-      <w:r>
-        <w:t>선택 항목 승인을 실행합니다.</w:t>
+        <w:t>설치형·별도 배포형 모두 Daon User 서버에서 실제 접근 가능한 API Endpoint를 사용합니다. Console 화면 주소와 API Endpoint를 혼동하지 않습니다.</w:t>
       </w:r>
     </w:p>
     <w:p>
@@ -4000,26 +3982,26 @@
         <w:widowControl/>
       </w:pPr>
       <w:r>
-        <w:t>Daon은 Preview 전체를 자동 승인하거나 자동 전송하지 않습니다. 충돌 상태이면 자동 덮어쓰지 말고 Version을 비교합니다.</w:t>
-      </w:r>
-    </w:p>
-    <w:p>
-      <w:bookmarkStart w:id="63" w:name="toc_63"/>
-      <w:pPr>
-        <w:pStyle w:val="Heading1"/>
-      </w:pPr>
-      <w:r>
-        <w:t>16. 조직 정책</w:t>
-      </w:r>
-      <w:bookmarkEnd w:id="63"/>
+        <w:t>라우터의 Auto는 모델 목록에서 선택하는 하나의 모델입니다. OmniRoute는 auto, OpenRouter는 openrouter/auto를 사용합니다. OpenAI 호환 연결은 시스템 관리자가 라우터 Auto 사용을 켜고 실제 Auto 모델 ID를 지정할 수 있습니다. 조회 목록에 없는 Auto에는 논리 모델 표시가 붙습니다. Auto 선택과 모델을 지정하지 않아 Provider의 기준 모델을 사용하는 것은 다릅니다. Combo 자동 선택 기능으로 설명하지 않습니다.</w:t>
+      </w:r>
     </w:p>
     <w:p>
       <w:pPr>
         <w:widowControl/>
       </w:pPr>
       <w:r>
-        <w:t>Notebook Workspace에서는 조직의 외부 전송 정책을 읽기 전용으로 확인합니다. 별도 설정 경로 /settings/organization에서는 현재 서버가 정책 변경 권한을 확인한 사용자만 조직 또는 Workspace 범위의 허용된 변경을 저장할 수 있습니다. 시스템 관리자 여부와 Workspace 역할은 같은 권한이 아니며 다른 범위의 정책을 임의로 바꾸지 않습니다.</w:t>
-      </w:r>
+        <w:t>하위 Provider 선택·우선순위·Fallback은 Gateway가 책임집니다. Daon User는 선택한 하나의 논리 모델을 호출하며 Gateway 내부 라우팅을 중복 구현하지 않습니다.</w:t>
+      </w:r>
+    </w:p>
+    <w:p>
+      <w:bookmarkStart w:id="60" w:name="toc_60"/>
+      <w:pPr>
+        <w:pStyle w:val="Heading2"/>
+      </w:pPr>
+      <w:r>
+        <w:t>13.4 Workspace 기본 모델 선택</w:t>
+      </w:r>
+      <w:bookmarkEnd w:id="60"/>
     </w:p>
     <w:p>
       <w:pPr>
@@ -4031,7 +4013,7 @@
         </w:numPr>
       </w:pPr>
       <w:r>
-        <w:t>정책 모드: 외부 전송 차단 또는 승인된 외부 전송</w:t>
+        <w:t>현재 화면의 Workspace 기본 모델에서 텍스트 생성 항목을 확인합니다.</w:t>
       </w:r>
     </w:p>
     <w:p>
@@ -4044,7 +4026,7 @@
         </w:numPr>
       </w:pPr>
       <w:r>
-        <w:t>허용 Provider 종류</w:t>
+        <w:t>연결 이름 · 모델 ID 형식의 항목을 선택합니다.</w:t>
       </w:r>
     </w:p>
     <w:p>
@@ -4057,7 +4039,7 @@
         </w:numPr>
       </w:pPr>
       <w:r>
-        <w:t>허용 목적지</w:t>
+        <w:t>기본 모델 저장을 선택합니다.</w:t>
       </w:r>
     </w:p>
     <w:p>
@@ -4070,72 +4052,7 @@
         </w:numPr>
       </w:pPr>
       <w:r>
-        <w:t>데이터 분류</w:t>
-      </w:r>
-    </w:p>
-    <w:p>
-      <w:pPr>
-        <w:spacing w:after="80" w:line="300" w:lineRule="auto"/>
-        <w:ind w:left="540" w:hanging="271"/>
-        <w:numPr>
-          <w:ilvl w:val="0"/>
-          <w:numId w:val="42"/>
-        </w:numPr>
-      </w:pPr>
-      <w:r>
-        <w:t>최대 전송량</w:t>
-      </w:r>
-    </w:p>
-    <w:p>
-      <w:pPr>
-        <w:spacing w:after="80" w:line="300" w:lineRule="auto"/>
-        <w:ind w:left="540" w:hanging="271"/>
-        <w:numPr>
-          <w:ilvl w:val="0"/>
-          <w:numId w:val="42"/>
-        </w:numPr>
-      </w:pPr>
-      <w:r>
-        <w:t>마스킹 필요 여부</w:t>
-      </w:r>
-    </w:p>
-    <w:p>
-      <w:pPr>
-        <w:spacing w:after="80" w:line="300" w:lineRule="auto"/>
-        <w:ind w:left="540" w:hanging="271"/>
-        <w:numPr>
-          <w:ilvl w:val="0"/>
-          <w:numId w:val="42"/>
-        </w:numPr>
-      </w:pPr>
-      <w:r>
-        <w:t>삭제 처리 필요 여부</w:t>
-      </w:r>
-    </w:p>
-    <w:p>
-      <w:pPr>
-        <w:spacing w:after="80" w:line="300" w:lineRule="auto"/>
-        <w:ind w:left="540" w:hanging="271"/>
-        <w:numPr>
-          <w:ilvl w:val="0"/>
-          <w:numId w:val="42"/>
-        </w:numPr>
-      </w:pPr>
-      <w:r>
-        <w:t>필수 승인자</w:t>
-      </w:r>
-    </w:p>
-    <w:p>
-      <w:pPr>
-        <w:spacing w:after="80" w:line="300" w:lineRule="auto"/>
-        <w:ind w:left="540" w:hanging="271"/>
-        <w:numPr>
-          <w:ilvl w:val="0"/>
-          <w:numId w:val="42"/>
-        </w:numPr>
-      </w:pPr>
-      <w:r>
-        <w:t>Workspace 적용 결과</w:t>
+        <w:t>저장 완료 후 선택이 유지되는지 확인합니다. 실제 질문 성공은 별도의 허용된 새 Run으로 확인합니다.</w:t>
       </w:r>
     </w:p>
     <w:p>
@@ -4143,78 +4060,18 @@
         <w:widowControl/>
       </w:pPr>
       <w:r>
-        <w:t>조직 차단 정책은 Workspace에서 완화할 수 없습니다. 변경에는 현재 권한·추가 인증·ETag 충돌 검사가 적용됩니다. 저장 후 유효 정책과 Workspace 적용 결과를 다시 확인하며 Endpoint 변경이나 다른 Provider로 우회하지 않습니다.</w:t>
-      </w:r>
-    </w:p>
-    <w:p>
-      <w:bookmarkStart w:id="64" w:name="toc_64"/>
-      <w:pPr>
-        <w:pStyle w:val="Heading1"/>
-      </w:pPr>
-      <w:r>
-        <w:t>17. 라이선스</w:t>
-      </w:r>
-      <w:bookmarkEnd w:id="64"/>
-    </w:p>
-    <w:p>
-      <w:bookmarkStart w:id="65" w:name="toc_65"/>
+        <w:t>모델 카탈로그의 이미지·문서·오디오 등 기능 표시는 이 화면에 모든 기능의 기본값 선택기나 실행 Adapter가 있다는 뜻이 아닙니다. 실행 코드가 없는 기능은 준비 중이며 모델 기능 보정만으로 실행 가능해지지 않습니다. 모델 이름만 보고 실제 지원·품질을 보장하지 않습니다.</w:t>
+      </w:r>
+    </w:p>
+    <w:p>
+      <w:bookmarkStart w:id="61" w:name="toc_61"/>
       <w:pPr>
         <w:pStyle w:val="Heading2"/>
       </w:pPr>
       <w:r>
-        <w:t>17.1 일반 사용자</w:t>
-      </w:r>
-      <w:bookmarkEnd w:id="65"/>
-    </w:p>
-    <w:p>
-      <w:pPr>
-        <w:widowControl/>
-      </w:pPr>
-      <w:r>
-        <w:t>제품, Edition, 일부만 표시된 License ID, 상태, 발급·만료일, 허용 기능과 사용 한도를 읽기 전용으로 확인합니다.</w:t>
-      </w:r>
-    </w:p>
-    <w:p>
-      <w:pPr>
-        <w:widowControl/>
-      </w:pPr>
-      <w:r>
-        <w:t>Daon User의 라이선스 적용 대상은 사용자 수와 Notebook 수입니다. LLM 사용은 수량 한도가 아니라 허용 기능으로 표시합니다. 저장용량, Source 버전, Studio 산출물과 API 호출 수는 별도 라이선스 항목으로 적용하지 않습니다.</w:t>
-      </w:r>
-    </w:p>
-    <w:p>
-      <w:pPr>
-        <w:widowControl/>
-      </w:pPr>
-      <w:r>
-        <w:t>라이선스가 없어도 기본 사용이 가능합니다. 기본값은 사용자 1명, Notebook 1개, LLM 사용 가능이며, 라이선스는 이 기본 한도를 확장하거나 LLM 사용 권한을 변경합니다. 한도에 도달해도 로그인과 기존 데이터 조회·내보내기는 유지됩니다.</w:t>
-      </w:r>
-    </w:p>
-    <w:p>
-      <w:pPr>
-        <w:widowControl/>
-      </w:pPr>
-      <w:r>
-        <w:t>상태는 미적용, 정상, 30일 이내 만료, 만료, 한도 도달로 표시될 수 있습니다.</w:t>
-      </w:r>
-    </w:p>
-    <w:p>
-      <w:bookmarkStart w:id="66" w:name="toc_66"/>
-      <w:pPr>
-        <w:pStyle w:val="Heading2"/>
-      </w:pPr>
-      <w:r>
-        <w:t>17.2 적용 권한이 확인된 관리자</w:t>
-      </w:r>
-      <w:bookmarkEnd w:id="66"/>
-    </w:p>
-    <w:p>
-      <w:pPr>
-        <w:widowControl/>
-      </w:pPr>
-      <w:r>
-        <w:t>서버가 can_apply=true로 판정한 경우에만 라이선스 등록·교체·적용 입력을 사용할 수 있습니다. 시스템 관리자 또는 현재 조직의 관리 권한이 검증된 사용자가 대상이며, Workspace 역할만으로 적용 권한이 생기지는 않습니다. 적용 권한이 없는 사용자는 제품·Edition·상태·만료일·기능·사용량을 조회합니다.</w:t>
-      </w:r>
+        <w:t>13.5 키 교체·삭제·카탈로그 새로고침</w:t>
+      </w:r>
+      <w:bookmarkEnd w:id="61"/>
     </w:p>
     <w:p>
       <w:pPr>
@@ -4226,7 +4083,7 @@
         </w:numPr>
       </w:pPr>
       <w:r>
-        <w:t>승인된 JSON License document를 준비합니다.</w:t>
+        <w:t>키 교체: 공용 연결은 권한 있는 관리자가 관리자 Key를, 비공용 연결은 본인이 개인 Key를 교체합니다. 키 교체만 필요한 경우 저장된 Endpoint 재입력이나 worker 재생성은 필요하지 않습니다.</w:t>
       </w:r>
     </w:p>
     <w:p>
@@ -4239,7 +4096,7 @@
         </w:numPr>
       </w:pPr>
       <w:r>
-        <w:t>현재 비밀번호를 입력합니다.</w:t>
+        <w:t>개인 Key: 내 계정 키 시험 및 저장과 내 계정 키 삭제는 본인 계정 범위입니다. 공용 설정이나 다른 사용자의 Key를 변경하지 않습니다.</w:t>
       </w:r>
     </w:p>
     <w:p>
@@ -4252,7 +4109,7 @@
         </w:numPr>
       </w:pPr>
       <w:r>
-        <w:t>Step-up 후 검증·적용을 선택합니다.</w:t>
+        <w:t>키 삭제: 연결·카탈로그 삭제와 다른 작업입니다. 필요한 Key가 없으면 해당 사용자의 실행이 차단될 수 있으므로 영향을 확인합니다.</w:t>
       </w:r>
     </w:p>
     <w:p>
@@ -4265,33 +4122,38 @@
         </w:numPr>
       </w:pPr>
       <w:r>
-        <w:t>제품, 조직, 기간, Schema와 서명 검증 결과를 확인합니다.</w:t>
-      </w:r>
+        <w:t>카탈로그 새로고침: 모델 목록 조회 후 허용 모델과 현재 Workspace 기본값을 다시 대조합니다. 조회만으로 기본 모델을 임의 교체하지 않습니다.</w:t>
+      </w:r>
+    </w:p>
+    <w:p>
+      <w:pPr>
+        <w:spacing w:after="80" w:line="300" w:lineRule="auto"/>
+        <w:ind w:left="540" w:hanging="271"/>
+        <w:numPr>
+          <w:ilvl w:val="0"/>
+          <w:numId w:val="43"/>
+        </w:numPr>
+      </w:pPr>
+      <w:r>
+        <w:t>연결 삭제: 현재 기본값 등에서 참조 중이면 거부될 수 있습니다. 참조를 우회해 삭제하지 않습니다.</w:t>
+      </w:r>
+    </w:p>
+    <w:p>
+      <w:bookmarkStart w:id="62" w:name="toc_62"/>
+      <w:pPr>
+        <w:pStyle w:val="Heading2"/>
+      </w:pPr>
+      <w:r>
+        <w:t>13.6 기존 환경변수 키 1회 이관(운영자)</w:t>
+      </w:r>
+      <w:bookmarkEnd w:id="62"/>
     </w:p>
     <w:p>
       <w:pPr>
         <w:widowControl/>
       </w:pPr>
       <w:r>
-        <w:t>License 원문과 비밀번호를 로그나 문의 글에 첨부하지 않습니다. 적용 권한이 없는 사용자에게는 적용 입력란이 보이지 않아야 합니다.</w:t>
-      </w:r>
-    </w:p>
-    <w:p>
-      <w:bookmarkStart w:id="67" w:name="toc_67"/>
-      <w:pPr>
-        <w:pStyle w:val="Heading1"/>
-      </w:pPr>
-      <w:r>
-        <w:t>18. 운영상태</w:t>
-      </w:r>
-      <w:bookmarkEnd w:id="67"/>
-    </w:p>
-    <w:p>
-      <w:pPr>
-        <w:widowControl/>
-      </w:pPr>
-      <w:r>
-        <w:t>Workspace App Bar의 운영상태에서 다음 구성요소를 확인합니다.</w:t>
+        <w:t>이 절차는 이전 배포에서 Provider 키를 환경변수로 사용하던 경우에만 수행합니다. 일반 사용자는 실행하지 않습니다.</w:t>
       </w:r>
     </w:p>
     <w:p>
@@ -4304,7 +4166,7 @@
         </w:numPr>
       </w:pPr>
       <w:r>
-        <w:t>Provider: LLM Provider와 선택 모델</w:t>
+        <w:t>비공개 master key 파일이 준비되어 API와 실제 Provider 호출 worker에 read-only Secret으로 제공되는지 확인합니다.</w:t>
       </w:r>
     </w:p>
     <w:p>
@@ -4317,7 +4179,7 @@
         </w:numPr>
       </w:pPr>
       <w:r>
-        <w:t>API: Workspace API</w:t>
+        <w:t>DB migration 0040 이후의 기존 Provider 연결과 Credential 저장 구조가 적용되어 있는지 확인합니다.</w:t>
       </w:r>
     </w:p>
     <w:p>
@@ -4330,7 +4192,7 @@
         </w:numPr>
       </w:pPr>
       <w:r>
-        <w:t>Storage: Database와 Object Storage</w:t>
+        <w:t>기존 키가 서버 환경에 있는 동안 운영용 scripts/import-provider-credentials.py를 실행합니다. 명령에 키 값을 직접 적지 않고 기존 환경변수 이름을 전달합니다.</w:t>
       </w:r>
     </w:p>
     <w:p>
@@ -4343,7 +4205,7 @@
         </w:numPr>
       </w:pPr>
       <w:r>
-        <w:t>Sync: 승인 또는 전송 대기</w:t>
+        <w:t>완료 결과의 imported·skipped·unused_provider_types 개수만 기록합니다. 키 원문은 출력하거나 보관하지 않습니다.</w:t>
       </w:r>
     </w:p>
     <w:p>
@@ -4356,33 +4218,46 @@
         </w:numPr>
       </w:pPr>
       <w:r>
-        <w:t>Queue: 처리 작업 대기와 실패</w:t>
-      </w:r>
+        <w:t>이미 Credential이 있는 연결은 이관으로 덮어쓰지 않습니다. 대응 연결이 없으면 Endpoint를 추측해 새로 만들지 않습니다.</w:t>
+      </w:r>
+    </w:p>
+    <w:p>
+      <w:pPr>
+        <w:spacing w:after="80" w:line="300" w:lineRule="auto"/>
+        <w:ind w:left="540" w:hanging="271"/>
+        <w:numPr>
+          <w:ilvl w:val="0"/>
+          <w:numId w:val="44"/>
+        </w:numPr>
+      </w:pPr>
+      <w:r>
+        <w:t>연결 상태와 실제 사용을 확인한 뒤 이전 키 환경변수와 OLLAMA_BASE_URL 의존을 제거합니다. 런타임의 환경변수 키 fallback으로 사용하지 않습니다.</w:t>
+      </w:r>
+    </w:p>
+    <w:p>
+      <w:bookmarkStart w:id="63" w:name="toc_63"/>
+      <w:pPr>
+        <w:pStyle w:val="Heading2"/>
+      </w:pPr>
+      <w:r>
+        <w:t>13.7 저장과 연결 시험</w:t>
+      </w:r>
+      <w:bookmarkEnd w:id="63"/>
     </w:p>
     <w:p>
       <w:pPr>
         <w:widowControl/>
       </w:pPr>
       <w:r>
-        <w:t>각 카드가 제공하는 LLM 설정 열기, 동기화 설정 열기, 상태 새로고침 같은 안전한 복구 동작만 사용합니다. 내부 Host, Port 또는 Stack 정보를 직접 입력해 우회하지 않습니다.</w:t>
-      </w:r>
-    </w:p>
-    <w:p>
-      <w:bookmarkStart w:id="68" w:name="toc_68"/>
-      <w:pPr>
-        <w:pStyle w:val="Heading1"/>
-      </w:pPr>
-      <w:r>
-        <w:t>19. 화면 설정과 접근성</w:t>
-      </w:r>
-      <w:bookmarkEnd w:id="68"/>
+        <w:t>LLM 설정에서 저장과 연결 시험은 서로 다른 동작입니다.</w:t>
+      </w:r>
     </w:p>
     <w:p>
       <w:pPr>
         <w:widowControl/>
       </w:pPr>
       <w:r>
-        <w:t>Notebook 홈의 설정 → 화면 설정에서 시스템 설정, 밝게, 어둡게를 선택합니다. 화면 설정 초기화는 화면 Preference만 초기화하며 Notebook, Source, 질문과 산출물을 삭제하지 않습니다.</w:t>
+        <w:t>| 버튼 | 동작 |</w:t>
       </w:r>
     </w:p>
     <w:p>
@@ -4390,18 +4265,32 @@
         <w:widowControl/>
       </w:pPr>
       <w:r>
-        <w:t>Dialog는 최초 입력 위치로 Focus를 이동하고, Tab 순환과 Escape 닫기를 지원합니다. 닫은 뒤에는 호출한 버튼으로 Focus가 돌아와야 합니다. Mobile 화면은 운영체제 글자 크기 조정을 지원하도록 설계되어 있습니다.</w:t>
-      </w:r>
-    </w:p>
-    <w:p>
-      <w:bookmarkStart w:id="69" w:name="toc_69"/>
-      <w:pPr>
-        <w:pStyle w:val="Heading1"/>
-      </w:pPr>
-      <w:r>
-        <w:t>20. Windows Desktop 사용 경계</w:t>
-      </w:r>
-      <w:bookmarkEnd w:id="69"/>
+        <w:t>| --- | --- |</w:t>
+      </w:r>
+    </w:p>
+    <w:p>
+      <w:pPr>
+        <w:widowControl/>
+      </w:pPr>
+      <w:r>
+        <w:t>| 저장 | Provider를 호출하지 않고 설정만 저장합니다. 저장된 Endpoint·Key·공용 전환은 미확인(사용 대기)으로 남습니다. |</w:t>
+      </w:r>
+    </w:p>
+    <w:p>
+      <w:pPr>
+        <w:widowControl/>
+      </w:pPr>
+      <w:r>
+        <w:t>| 연결 시험 | 입력한 값으로 연결만 확인합니다. 저장하지 않습니다. 저장된 설정을 그대로 시험했을 때만 그 연결의 확인 상태가 갱신됩니다. |</w:t>
+      </w:r>
+    </w:p>
+    <w:p>
+      <w:pPr>
+        <w:widowControl/>
+      </w:pPr>
+      <w:r>
+        <w:t>| 변경 취소 | 저장된 값으로 되돌립니다. |</w:t>
+      </w:r>
     </w:p>
     <w:p>
       <w:pPr>
@@ -4413,7 +4302,7 @@
         </w:numPr>
       </w:pPr>
       <w:r>
-        <w:t>Windows 앱은 로컬 Source와 오프라인 Studio 초안을 사용할 수 있습니다.</w:t>
+        <w:t>화면에 미저장 변경: …, 저장 중…, 저장 완료, 저장 실패(기존 설정은 바뀌지 않음)가 표시됩니다.</w:t>
       </w:r>
     </w:p>
     <w:p>
@@ -4426,7 +4315,7 @@
         </w:numPr>
       </w:pPr>
       <w:r>
-        <w:t>Cloud와 끊어진 상태에서는 외부 Provider 호출과 Cloud 전용 작업이 제한됩니다.</w:t>
+        <w:t>모델 체크박스를 바꾸는 것은 임시 입력입니다. 저장을 눌러야 허용 목록에 반영됩니다.</w:t>
       </w:r>
     </w:p>
     <w:p>
@@ -4439,7 +4328,7 @@
         </w:numPr>
       </w:pPr>
       <w:r>
-        <w:t>재연결 후 자동 전체 동기화하지 않고 Preview와 승인 절차를 거칩니다.</w:t>
+        <w:t>연결 시험은 사용료가 발생할 수 있어 같은 버튼을 연달아 눌러도 한 번만 실행됩니다.</w:t>
       </w:r>
     </w:p>
     <w:p>
@@ -4452,7 +4341,7 @@
         </w:numPr>
       </w:pPr>
       <w:r>
-        <w:t>로컬 작업과 Cloud Version이 충돌하면 어느 한쪽을 자동 덮어쓰지 않습니다.</w:t>
+        <w:t>직접 입력형(CUSTOM)·라우터 연결과 새 연결은 새 모델을 시험으로 확인해야 목록에 올릴 수 있어 연결 시험 및 저장 버튼을 함께 씁니다.</w:t>
       </w:r>
     </w:p>
     <w:p>
@@ -4465,33 +4354,149 @@
         </w:numPr>
       </w:pPr>
       <w:r>
-        <w:t>Desktop에서 지원하는 Studio 범위는 현재 연결된 Local Service와 모델에 따라 달라집니다.</w:t>
-      </w:r>
+        <w:t>공용 연결에는 저장된 시스템 Key가 필요합니다. 개인 연결을 공용으로 바꾸며 Key를 넣을 때는 공용 사용을 체크하고 Key를 입력한 뒤 저장을 한 번에 누릅니다.</w:t>
+      </w:r>
+    </w:p>
+    <w:p>
+      <w:bookmarkStart w:id="64" w:name="toc_64"/>
+      <w:pPr>
+        <w:pStyle w:val="Heading2"/>
+      </w:pPr>
+      <w:r>
+        <w:t>13.8 오류 원인과 조치</w:t>
+      </w:r>
+      <w:bookmarkEnd w:id="64"/>
     </w:p>
     <w:p>
       <w:pPr>
         <w:widowControl/>
       </w:pPr>
       <w:r>
-        <w:t>설치, 업데이트, 제거와 복구 절차는 제공된 설치 패키지의 운영 안내를 따릅니다. 현재 설치 패키지를 받지 못했다면 임의 개발 빌드를 사용하지 않습니다.</w:t>
-      </w:r>
-    </w:p>
-    <w:p>
-      <w:bookmarkStart w:id="70" w:name="toc_70"/>
+        <w:t>오류에는 원인, 조치, 오류 코드가 함께 표시되며 기존 정상 설정은 바뀌지 않습니다.</w:t>
+      </w:r>
+    </w:p>
+    <w:p>
+      <w:pPr>
+        <w:widowControl/>
+      </w:pPr>
+      <w:r>
+        <w:t>| 오류 코드 | 원인 | 조치 |</w:t>
+      </w:r>
+    </w:p>
+    <w:p>
+      <w:pPr>
+        <w:widowControl/>
+      </w:pPr>
+      <w:r>
+        <w:t>| --- | --- | --- |</w:t>
+      </w:r>
+    </w:p>
+    <w:p>
+      <w:pPr>
+        <w:widowControl/>
+      </w:pPr>
+      <w:r>
+        <w:t>| PROVIDER_CREDENTIAL_REQUIRED | 공용 연결에 저장된 Key가 없음 | API Key를 입력해 저장 |</w:t>
+      </w:r>
+    </w:p>
+    <w:p>
+      <w:pPr>
+        <w:widowControl/>
+      </w:pPr>
+      <w:r>
+        <w:t>| PROVIDER_AUTHENTICATION_FAILED | Provider가 Key를 거부함 | Key가 맞는지, 만료되지 않았는지 확인 |</w:t>
+      </w:r>
+    </w:p>
+    <w:p>
+      <w:pPr>
+        <w:widowControl/>
+      </w:pPr>
+      <w:r>
+        <w:t>| PROVIDER_BASE_URL_INVALID | Endpoint 형식·허용 범위 오류 | https 주소와 경로(/v1 등) 확인 |</w:t>
+      </w:r>
+    </w:p>
+    <w:p>
+      <w:pPr>
+        <w:widowControl/>
+      </w:pPr>
+      <w:r>
+        <w:t>| PROVIDER_CATALOG_UNAVAILABLE | Provider 응답 지연·5xx | 잠시 후 다시 시험, 반복되면 서버의 외부 접속(방화벽·프록시) 확인 |</w:t>
+      </w:r>
+    </w:p>
+    <w:p>
+      <w:pPr>
+        <w:widowControl/>
+      </w:pPr>
+      <w:r>
+        <w:t>| PROVIDER_ALLOWED_MODEL_UNKNOWN | 허용하려는 모델이 목록에 없음 | 모델 조회 후 다시 선택 |</w:t>
+      </w:r>
+    </w:p>
+    <w:p>
+      <w:pPr>
+        <w:widowControl/>
+      </w:pPr>
+      <w:r>
+        <w:t>| PROVIDER_SHORT_CODE_CONFLICT | 두 글자 약어 중복 | 다른 약어 입력 |</w:t>
+      </w:r>
+    </w:p>
+    <w:p>
+      <w:pPr>
+        <w:widowControl/>
+      </w:pPr>
+      <w:r>
+        <w:t>| PROVIDER_PERSONAL_SYSTEM_KEY_FORBIDDEN | 개인 연결에 시스템 Key 저장 시도 | 공용으로 바꾸거나 Key 입력을 비움 |</w:t>
+      </w:r>
+    </w:p>
+    <w:p>
+      <w:pPr>
+        <w:widowControl/>
+      </w:pPr>
+      <w:r>
+        <w:t>| VERSION_CONFLICT | 다른 곳에서 먼저 변경됨 | 새로고침 후 다시 시도 |</w:t>
+      </w:r>
+    </w:p>
+    <w:p>
+      <w:pPr>
+        <w:widowControl/>
+      </w:pPr>
+      <w:r>
+        <w:t>| 5xx | 서버·DB 저장 실패 | 잠시 후 재시도, 반복되면 오류 코드를 관리자에게 전달 |</w:t>
+      </w:r>
+    </w:p>
+    <w:p>
+      <w:bookmarkStart w:id="65" w:name="toc_65"/>
+      <w:pPr>
+        <w:pStyle w:val="Heading2"/>
+      </w:pPr>
+      <w:r>
+        <w:t>13.9 추론 수준 확인(관리자)</w:t>
+      </w:r>
+      <w:bookmarkEnd w:id="65"/>
+    </w:p>
+    <w:p>
+      <w:pPr>
+        <w:widowControl/>
+      </w:pPr>
+      <w:r>
+        <w:t>선택한 연결의 허용 모델마다 추론 수준 확인 버튼이 있습니다. 수준마다 아주 작은 요청을 보내 모델이 받아 주는 수준만 지원 확인으로 저장합니다. 일시 오류는 거부와 구별해 몇 번 다시 시도합니다. 받아 준다는 것은 요청 필드를 거부하지 않는다는 뜻이며, 제공자가 수준을 실제로 반영했는지는 외부에서 확인할 수 없습니다. 처음 선택하는 모델은 사용자가 고를 때 자동으로 확인되므로 이 버튼은 다시 확인할 때만 씁니다.</w:t>
+      </w:r>
+    </w:p>
+    <w:p>
+      <w:bookmarkStart w:id="66" w:name="toc_66"/>
       <w:pPr>
         <w:pStyle w:val="Heading1"/>
       </w:pPr>
       <w:r>
-        <w:t>21. Mobile 사용 경계</w:t>
-      </w:r>
-      <w:bookmarkEnd w:id="70"/>
+        <w:t>14. 출력·버전 설정</w:t>
+      </w:r>
+      <w:bookmarkEnd w:id="66"/>
     </w:p>
     <w:p>
       <w:pPr>
         <w:widowControl/>
       </w:pPr>
       <w:r>
-        <w:t>Mobile 계약상 허용되는 작업에는 제목·텍스트 블록·간단한 표 셀 편집, 검토 의견, 수정 요청, 승인·거부, 알림 처리와 Citation 열기가 포함됩니다.</w:t>
+        <w:t>산출물 유형별 기본 출력 형식을 선택합니다. 변경한 뒤 저장을 선택합니다. 저장하지 않은 변경이 있는 상태에서 닫으면 저장, 버리기, 계속 편집 중 하나를 선택해야 합니다.</w:t>
       </w:r>
     </w:p>
     <w:p>
@@ -4499,26 +4504,18 @@
         <w:widowControl/>
       </w:pPr>
       <w:r>
-        <w:t>섹션 구조 변경, Layout 변경, 표 구조 변경, 근거 연결 변경, 생성 설정 변경과 전체 재생성은 Mobile에서 허용되지 않으며 Web·Windows에서 계속해야 합니다.</w:t>
-      </w:r>
-    </w:p>
-    <w:p>
-      <w:pPr>
-        <w:widowControl/>
-      </w:pPr>
-      <w:r>
-        <w:t>현재 Mobile 실제 배포와 실기기 검증은 미완료 범위입니다. 조직이 승인한 설치본과 서버 연결이 없다면 Mobile Shell의 화면 계약만으로 실제 사용 가능하다고 판단하지 않습니다.</w:t>
-      </w:r>
-    </w:p>
-    <w:p>
-      <w:bookmarkStart w:id="71" w:name="toc_71"/>
+        <w:t>Version 저장 방식은 append-only입니다. 화면 설정을 바꾸더라도 기존 산출물 Version은 삭제되지 않습니다.</w:t>
+      </w:r>
+    </w:p>
+    <w:p>
+      <w:bookmarkStart w:id="67" w:name="toc_67"/>
       <w:pPr>
         <w:pStyle w:val="Heading1"/>
       </w:pPr>
       <w:r>
-        <w:t>22. 사용자 설명서 Hub</w:t>
-      </w:r>
-      <w:bookmarkEnd w:id="71"/>
+        <w:t>15. 동기화·승인</w:t>
+      </w:r>
+      <w:bookmarkEnd w:id="67"/>
     </w:p>
     <w:p>
       <w:pPr>
@@ -4530,7 +4527,7 @@
         </w:numPr>
       </w:pPr>
       <w:r>
-        <w:t>설정 → 사용자 설명서를 엽니다.</w:t>
+        <w:t>설정 → 동기화·승인을 엽니다.</w:t>
       </w:r>
     </w:p>
     <w:p>
@@ -4543,7 +4540,7 @@
         </w:numPr>
       </w:pPr>
       <w:r>
-        <w:t>검색란에 문서 제목이나 설명을 입력합니다.</w:t>
+        <w:t>동기화 Preview에서 대기 항목과 Version을 확인합니다.</w:t>
       </w:r>
     </w:p>
     <w:p>
@@ -4556,7 +4553,7 @@
         </w:numPr>
       </w:pPr>
       <w:r>
-        <w:t>문서를 선택해 Web에서 읽습니다.</w:t>
+        <w:t>승인할 항목만 체크합니다.</w:t>
       </w:r>
     </w:p>
     <w:p>
@@ -4569,7 +4566,7 @@
         </w:numPr>
       </w:pPr>
       <w:r>
-        <w:t>필요한 경우 DOCX 또는 PDF를 선택해 내려받습니다.</w:t>
+        <w:t>현재 비밀번호로 Step-up을 수행합니다.</w:t>
       </w:r>
     </w:p>
     <w:p>
@@ -4582,7 +4579,7 @@
         </w:numPr>
       </w:pPr>
       <w:r>
-        <w:t>Hub 상단의 Release와 언어를 확인합니다.</w:t>
+        <w:t>선택 항목 승인을 실행합니다.</w:t>
       </w:r>
     </w:p>
     <w:p>
@@ -4590,18 +4587,26 @@
         <w:widowControl/>
       </w:pPr>
       <w:r>
-        <w:t>다운로드는 허용된 same-origin 문서만 사용합니다. 내부 경로나 임의 URL을 조합하지 않습니다.</w:t>
-      </w:r>
-    </w:p>
-    <w:p>
-      <w:bookmarkStart w:id="72" w:name="toc_72"/>
+        <w:t>Daon은 Preview 전체를 자동 승인하거나 자동 전송하지 않습니다. 충돌 상태이면 자동 덮어쓰지 말고 Version을 비교합니다.</w:t>
+      </w:r>
+    </w:p>
+    <w:p>
+      <w:bookmarkStart w:id="68" w:name="toc_68"/>
       <w:pPr>
         <w:pStyle w:val="Heading1"/>
       </w:pPr>
       <w:r>
-        <w:t>23. 예상 결과와 보안 사용 원칙</w:t>
-      </w:r>
-      <w:bookmarkEnd w:id="72"/>
+        <w:t>16. 조직 정책</w:t>
+      </w:r>
+      <w:bookmarkEnd w:id="68"/>
+    </w:p>
+    <w:p>
+      <w:pPr>
+        <w:widowControl/>
+      </w:pPr>
+      <w:r>
+        <w:t>Notebook Workspace에서는 조직의 외부 전송 정책을 읽기 전용으로 확인합니다. 별도 설정 경로 /settings/organization에서는 현재 서버가 정책 변경 권한을 확인한 사용자만 조직 또는 Workspace 범위의 허용된 변경을 저장할 수 있습니다. 시스템 관리자 여부와 Workspace 역할은 같은 권한이 아니며 다른 범위의 정책을 임의로 바꾸지 않습니다.</w:t>
+      </w:r>
     </w:p>
     <w:p>
       <w:pPr>
@@ -4613,7 +4618,7 @@
         </w:numPr>
       </w:pPr>
       <w:r>
-        <w:t>비밀번호, 이메일 인증 토큰, 재설정 토큰, API Key와 License 원문을 공유하지 않습니다.</w:t>
+        <w:t>정책 모드: 외부 전송 차단 또는 승인된 외부 전송</w:t>
       </w:r>
     </w:p>
     <w:p>
@@ -4626,7 +4631,7 @@
         </w:numPr>
       </w:pPr>
       <w:r>
-        <w:t>Source 원문이나 LLM 응답을 오류 로그에 그대로 붙이지 않습니다.</w:t>
+        <w:t>허용 Provider 종류</w:t>
       </w:r>
     </w:p>
     <w:p>
@@ -4639,7 +4644,7 @@
         </w:numPr>
       </w:pPr>
       <w:r>
-        <w:t>권한 오류를 다른 계정, 내부 주소 또는 임시 Token으로 우회하지 않습니다.</w:t>
+        <w:t>허용 목적지</w:t>
       </w:r>
     </w:p>
     <w:p>
@@ -4652,7 +4657,7 @@
         </w:numPr>
       </w:pPr>
       <w:r>
-        <w:t>승인과 외부 전송은 화면에서 명시적으로 선택합니다.</w:t>
+        <w:t>데이터 분류</w:t>
       </w:r>
     </w:p>
     <w:p>
@@ -4665,7 +4670,7 @@
         </w:numPr>
       </w:pPr>
       <w:r>
-        <w:t>공용 PC에서는 로그아웃 후 브라우저를 닫습니다.</w:t>
+        <w:t>최대 전송량</w:t>
       </w:r>
     </w:p>
     <w:p>
@@ -4678,197 +4683,204 @@
         </w:numPr>
       </w:pPr>
       <w:r>
-        <w:t>권한이 축소되면 이전에 열었던 화면도 계속 접근할 수 있다고 가정하지 않습니다.</w:t>
-      </w:r>
-    </w:p>
-    <w:p>
-      <w:bookmarkStart w:id="73" w:name="toc_73"/>
+        <w:t>마스킹 필요 여부</w:t>
+      </w:r>
+    </w:p>
+    <w:p>
+      <w:pPr>
+        <w:spacing w:after="80" w:line="300" w:lineRule="auto"/>
+        <w:ind w:left="540" w:hanging="271"/>
+        <w:numPr>
+          <w:ilvl w:val="0"/>
+          <w:numId w:val="47"/>
+        </w:numPr>
+      </w:pPr>
+      <w:r>
+        <w:t>삭제 처리 필요 여부</w:t>
+      </w:r>
+    </w:p>
+    <w:p>
+      <w:pPr>
+        <w:spacing w:after="80" w:line="300" w:lineRule="auto"/>
+        <w:ind w:left="540" w:hanging="271"/>
+        <w:numPr>
+          <w:ilvl w:val="0"/>
+          <w:numId w:val="47"/>
+        </w:numPr>
+      </w:pPr>
+      <w:r>
+        <w:t>필수 승인자</w:t>
+      </w:r>
+    </w:p>
+    <w:p>
+      <w:pPr>
+        <w:spacing w:after="80" w:line="300" w:lineRule="auto"/>
+        <w:ind w:left="540" w:hanging="271"/>
+        <w:numPr>
+          <w:ilvl w:val="0"/>
+          <w:numId w:val="47"/>
+        </w:numPr>
+      </w:pPr>
+      <w:r>
+        <w:t>Workspace 적용 결과</w:t>
+      </w:r>
+    </w:p>
+    <w:p>
+      <w:pPr>
+        <w:widowControl/>
+      </w:pPr>
+      <w:r>
+        <w:t>새 설치의 초기 정책은 외부 전송 차단입니다. 개발 단계 설치에서는 deploy/daon2-user/seed가 admin 조직·Workspace의 시드된 차단 정책을 아래 값으로 열어 둡니다(이미 저장된 정책은 건드리지 않음).</w:t>
+      </w:r>
+    </w:p>
+    <w:p>
+      <w:pPr>
+        <w:widowControl/>
+      </w:pPr>
+      <w:r>
+        <w:t>| 항목 | 초기값 |</w:t>
+      </w:r>
+    </w:p>
+    <w:p>
+      <w:pPr>
+        <w:widowControl/>
+      </w:pPr>
+      <w:r>
+        <w:t>| --- | --- |</w:t>
+      </w:r>
+    </w:p>
+    <w:p>
+      <w:pPr>
+        <w:widowControl/>
+      </w:pPr>
+      <w:r>
+        <w:t>| 정책 모드 | 추가 인증 없이 허용 |</w:t>
+      </w:r>
+    </w:p>
+    <w:p>
+      <w:pPr>
+        <w:widowControl/>
+      </w:pPr>
+      <w:r>
+        <w:t>| 허용 Provider 종류 | external_api,server_internal,local_runtime |</w:t>
+      </w:r>
+    </w:p>
+    <w:p>
+      <w:pPr>
+        <w:widowControl/>
+      </w:pPr>
+      <w:r>
+        <w:t>| 허용 목적지 | media-bridge-gateway.sinsan.kr,api.upstage.ai,omniroute.sinsan.kr,tts.supertonic.sinsan.kr |</w:t>
+      </w:r>
+    </w:p>
+    <w:p>
+      <w:pPr>
+        <w:widowControl/>
+      </w:pPr>
+      <w:r>
+        <w:t>| 최대 전송 bytes | 1048576 |</w:t>
+      </w:r>
+    </w:p>
+    <w:p>
+      <w:pPr>
+        <w:widowControl/>
+      </w:pPr>
+      <w:r>
+        <w:t>| 분류 | restricted |</w:t>
+      </w:r>
+    </w:p>
+    <w:p>
+      <w:pPr>
+        <w:widowControl/>
+      </w:pPr>
+      <w:r>
+        <w:t>| 마스킹·삭제 처리 필수 | 체크 |</w:t>
+      </w:r>
+    </w:p>
+    <w:p>
+      <w:pPr>
+        <w:widowControl/>
+      </w:pPr>
+      <w:r>
+        <w:t>직접 설정할 때는 1. 조직 정책과 2. Workspace 정책 두 탭을 모두 같은 값으로 저장해야 최종 정책이 열립니다. Provider 종류와 목적지는 쉼표로 구분하고 오타(예: external_api의 첫 글자 누락)가 있으면 EGRESS_POLICY_PAYLOAD_INVALID로 저장되지 않습니다.</w:t>
+      </w:r>
+    </w:p>
+    <w:p>
+      <w:pPr>
+        <w:widowControl/>
+      </w:pPr>
+      <w:r>
+        <w:t>조직 차단 정책은 Workspace에서 완화할 수 없습니다. 변경에는 현재 권한·추가 인증·ETag 충돌 검사가 적용됩니다. 저장 후 유효 정책과 Workspace 적용 결과를 다시 확인하며 Endpoint 변경이나 다른 Provider로 우회하지 않습니다.</w:t>
+      </w:r>
+    </w:p>
+    <w:p>
+      <w:bookmarkStart w:id="69" w:name="toc_69"/>
       <w:pPr>
         <w:pStyle w:val="Heading1"/>
       </w:pPr>
       <w:r>
-        <w:t>24. 제한·오류 대응</w:t>
-      </w:r>
-      <w:bookmarkEnd w:id="73"/>
-    </w:p>
-    <w:p>
-      <w:bookmarkStart w:id="74" w:name="toc_74"/>
+        <w:t>17. 라이선스</w:t>
+      </w:r>
+      <w:bookmarkEnd w:id="69"/>
+    </w:p>
+    <w:p>
+      <w:bookmarkStart w:id="70" w:name="toc_70"/>
       <w:pPr>
         <w:pStyle w:val="Heading2"/>
       </w:pPr>
       <w:r>
-        <w:t>보호된 화면이 로그인 없이 보임</w:t>
-      </w:r>
-      <w:bookmarkEnd w:id="74"/>
+        <w:t>17.1 일반 사용자</w:t>
+      </w:r>
+      <w:bookmarkEnd w:id="70"/>
     </w:p>
     <w:p>
       <w:pPr>
         <w:widowControl/>
       </w:pPr>
       <w:r>
-        <w:t>정상 상태가 아닙니다. 브라우저를 닫고 운영 담당자에게 접속 주소, 발생 시각과 화면 종류만 전달합니다. 화면에 포함된 업무 데이터는 공개 채널에 첨부하지 않습니다.</w:t>
-      </w:r>
-    </w:p>
-    <w:p>
-      <w:bookmarkStart w:id="75" w:name="toc_75"/>
+        <w:t>제품, Edition, 일부만 표시된 License ID, 상태, 발급·만료일, 허용 기능과 사용 한도를 읽기 전용으로 확인합니다.</w:t>
+      </w:r>
+    </w:p>
+    <w:p>
+      <w:pPr>
+        <w:widowControl/>
+      </w:pPr>
+      <w:r>
+        <w:t>Daon User의 라이선스 적용 대상은 사용자 수와 Notebook 수입니다. LLM 사용은 수량 한도가 아니라 허용 기능으로 표시합니다. 저장용량, Source 버전, Studio 산출물과 API 호출 수는 별도 라이선스 항목으로 적용하지 않습니다.</w:t>
+      </w:r>
+    </w:p>
+    <w:p>
+      <w:pPr>
+        <w:widowControl/>
+      </w:pPr>
+      <w:r>
+        <w:t>라이선스가 없어도 기본 사용이 가능합니다. 기본값은 사용자 1명, Notebook 1개, LLM 사용 가능이며, 라이선스는 이 기본 한도를 확장하거나 LLM 사용 권한을 변경합니다. 한도에 도달해도 로그인과 기존 데이터 조회·내보내기는 유지됩니다.</w:t>
+      </w:r>
+    </w:p>
+    <w:p>
+      <w:pPr>
+        <w:widowControl/>
+      </w:pPr>
+      <w:r>
+        <w:t>상태는 미적용, 정상, 30일 이내 만료, 만료, 한도 도달로 표시될 수 있습니다.</w:t>
+      </w:r>
+    </w:p>
+    <w:p>
+      <w:bookmarkStart w:id="71" w:name="toc_71"/>
       <w:pPr>
         <w:pStyle w:val="Heading2"/>
       </w:pPr>
       <w:r>
-        <w:t>로그아웃 후 Notebook이 다시 보임</w:t>
-      </w:r>
-      <w:bookmarkEnd w:id="75"/>
+        <w:t>17.2 적용 권한이 확인된 관리자</w:t>
+      </w:r>
+      <w:bookmarkEnd w:id="71"/>
     </w:p>
     <w:p>
       <w:pPr>
         <w:widowControl/>
       </w:pPr>
       <w:r>
-        <w:t>페이지를 새로고침하고 /notebooks 직접 접근을 확인합니다. 계속 보이면 Session 종료 결함일 수 있으므로 추가 작업을 중지하고 신고합니다.</w:t>
-      </w:r>
-    </w:p>
-    <w:p>
-      <w:bookmarkStart w:id="76" w:name="toc_76"/>
-      <w:pPr>
-        <w:pStyle w:val="Heading2"/>
-      </w:pPr>
-      <w:r>
-        <w:t>Source 목록을 불러오지 못함</w:t>
-      </w:r>
-      <w:bookmarkEnd w:id="76"/>
-    </w:p>
-    <w:p>
-      <w:pPr>
-        <w:widowControl/>
-      </w:pPr>
-      <w:r>
-        <w:t>운영상태에서 API와 Storage를 확인하고 다시 불러옵니다. 기존 Source를 삭제하거나 같은 파일을 반복 등록하지 않습니다.</w:t>
-      </w:r>
-    </w:p>
-    <w:p>
-      <w:bookmarkStart w:id="77" w:name="toc_77"/>
-      <w:pPr>
-        <w:pStyle w:val="Heading2"/>
-      </w:pPr>
-      <w:r>
-        <w:t>Source가 `부분 이해` 또는 `검토 필요`</w:t>
-      </w:r>
-      <w:bookmarkEnd w:id="77"/>
-    </w:p>
-    <w:p>
-      <w:pPr>
-        <w:widowControl/>
-      </w:pPr>
-      <w:r>
-        <w:t>해당 Source만으로 최종 결과를 승인하지 않습니다. PDF로 변환해 재등록하거나 조직이 지원하는 Adapter 준비 여부를 확인합니다.</w:t>
-      </w:r>
-    </w:p>
-    <w:p>
-      <w:bookmarkStart w:id="78" w:name="toc_78"/>
-      <w:pPr>
-        <w:pStyle w:val="Heading2"/>
-      </w:pPr>
-      <w:r>
-        <w:t>선택 모델이 없음</w:t>
-      </w:r>
-      <w:bookmarkEnd w:id="78"/>
-    </w:p>
-    <w:p>
-      <w:pPr>
-        <w:widowControl/>
-      </w:pPr>
-      <w:r>
-        <w:t>LLM 설정의 Workspace 기본 모델에서 텍스트 생성에 사용할 연결과 모델을 선택했는지 확인합니다. 항목이 없으면 연결 활성 상태, 연결 확인 결과, 허용 모델과 현재 사용자의 Credential 범위를 확인합니다.</w:t>
-      </w:r>
-    </w:p>
-    <w:p>
-      <w:bookmarkStart w:id="79" w:name="toc_79"/>
-      <w:pPr>
-        <w:pStyle w:val="Heading2"/>
-      </w:pPr>
-      <w:r>
-        <w:t>Provider 연결 확인이 실패함</w:t>
-      </w:r>
-      <w:bookmarkEnd w:id="79"/>
-    </w:p>
-    <w:p>
-      <w:pPr>
-        <w:widowControl/>
-      </w:pPr>
-      <w:r>
-        <w:t>Endpoint의 오타, 서버에서의 접근 가능 여부, Key의 유효성, 실제 Gateway 모델 ID를 확인합니다. Key 원문이나 Provider 응답 본문을 오류 보고에 포함하지 않습니다. 키 교체만 필요한 경우 Endpoint를 다시 입력하거나 worker를 재생성하지 않습니다.</w:t>
-      </w:r>
-    </w:p>
-    <w:p>
-      <w:bookmarkStart w:id="80" w:name="toc_80"/>
-      <w:pPr>
-        <w:pStyle w:val="Heading2"/>
-      </w:pPr>
-      <w:r>
-        <w:t>외부 전송이 거부됨</w:t>
-      </w:r>
-      <w:bookmarkEnd w:id="80"/>
-    </w:p>
-    <w:p>
-      <w:pPr>
-        <w:widowControl/>
-      </w:pPr>
-      <w:r>
-        <w:t>조직 정책에서 허용 Provider, 목적지, 데이터 분류, 최대 전송량과 마스킹 조건을 확인합니다. 정책을 우회하지 않습니다.</w:t>
-      </w:r>
-    </w:p>
-    <w:p>
-      <w:bookmarkStart w:id="81" w:name="toc_81"/>
-      <w:pPr>
-        <w:pStyle w:val="Heading2"/>
-      </w:pPr>
-      <w:r>
-        <w:t>Studio 버튼이 비활성화됨</w:t>
-      </w:r>
-      <w:bookmarkEnd w:id="81"/>
-    </w:p>
-    <w:p>
-      <w:pPr>
-        <w:widowControl/>
-      </w:pPr>
-      <w:r>
-        <w:t>필수 생성 설정, Source Version, 설정 확인 여부, 검토·승인 단계와 현재 권한을 확인합니다.</w:t>
-      </w:r>
-    </w:p>
-    <w:p>
-      <w:bookmarkStart w:id="82" w:name="toc_82"/>
-      <w:pPr>
-        <w:pStyle w:val="Heading2"/>
-      </w:pPr>
-      <w:r>
-        <w:t>내보내기가 되지 않음</w:t>
-      </w:r>
-      <w:bookmarkEnd w:id="82"/>
-    </w:p>
-    <w:p>
-      <w:pPr>
-        <w:widowControl/>
-      </w:pPr>
-      <w:r>
-        <w:t>산출물 상태가 승인됨인지, 선택한 형식이 해당 유형에 허용되는지, 라이선스와 현재 권한이 유효한지 확인합니다.</w:t>
-      </w:r>
-    </w:p>
-    <w:p>
-      <w:bookmarkStart w:id="83" w:name="toc_83"/>
-      <w:pPr>
-        <w:pStyle w:val="Heading2"/>
-      </w:pPr>
-      <w:r>
-        <w:t>오류를 담당자에게 전달할 때</w:t>
-      </w:r>
-      <w:bookmarkEnd w:id="83"/>
-    </w:p>
-    <w:p>
-      <w:pPr>
-        <w:widowControl/>
-      </w:pPr>
-      <w:r>
-        <w:t>다음 정보만 전달합니다.</w:t>
+        <w:t>서버가 can_apply=true로 판정한 경우에만 라이선스 등록·교체·적용 입력을 사용할 수 있습니다. 시스템 관리자 또는 현재 조직의 관리 권한이 검증된 사용자가 대상이며, Workspace 역할만으로 적용 권한이 생기지는 않습니다. 적용 권한이 없는 사용자는 제품·Edition·상태·만료일·기능·사용량을 조회합니다.</w:t>
       </w:r>
     </w:p>
     <w:p>
@@ -4881,7 +4893,7 @@
         </w:numPr>
       </w:pPr>
       <w:r>
-        <w:t>발생 시각</w:t>
+        <w:t>승인된 JSON License document를 준비합니다.</w:t>
       </w:r>
     </w:p>
     <w:p>
@@ -4894,7 +4906,7 @@
         </w:numPr>
       </w:pPr>
       <w:r>
-        <w:t>사용한 플랫폼과 화면 이름</w:t>
+        <w:t>현재 비밀번호를 입력합니다.</w:t>
       </w:r>
     </w:p>
     <w:p>
@@ -4907,7 +4919,7 @@
         </w:numPr>
       </w:pPr>
       <w:r>
-        <w:t>수행하려던 동작</w:t>
+        <w:t>Step-up 후 검증·적용을 선택합니다.</w:t>
       </w:r>
     </w:p>
     <w:p>
@@ -4920,20 +4932,7 @@
         </w:numPr>
       </w:pPr>
       <w:r>
-        <w:t>화면에 표시된 안전한 오류 코드 또는 문구</w:t>
-      </w:r>
-    </w:p>
-    <w:p>
-      <w:pPr>
-        <w:spacing w:after="80" w:line="300" w:lineRule="auto"/>
-        <w:ind w:left="540" w:hanging="271"/>
-        <w:numPr>
-          <w:ilvl w:val="0"/>
-          <w:numId w:val="48"/>
-        </w:numPr>
-      </w:pPr>
-      <w:r>
-        <w:t>재현 여부</w:t>
+        <w:t>제품, 조직, 기간, Schema와 서명 검증 결과를 확인합니다.</w:t>
       </w:r>
     </w:p>
     <w:p>
@@ -4941,18 +4940,26 @@
         <w:widowControl/>
       </w:pPr>
       <w:r>
-        <w:t>비밀번호, Token, Source 원문, 내부 주소와 전체 응답 본문은 전달하지 않습니다.</w:t>
-      </w:r>
-    </w:p>
-    <w:p>
-      <w:bookmarkStart w:id="84" w:name="toc_84"/>
+        <w:t>License 원문과 비밀번호를 로그나 문의 글에 첨부하지 않습니다. 적용 권한이 없는 사용자에게는 적용 입력란이 보이지 않아야 합니다.</w:t>
+      </w:r>
+    </w:p>
+    <w:p>
+      <w:bookmarkStart w:id="72" w:name="toc_72"/>
       <w:pPr>
         <w:pStyle w:val="Heading1"/>
       </w:pPr>
       <w:r>
-        <w:t>25. 현재 구현·검증 제한</w:t>
-      </w:r>
-      <w:bookmarkEnd w:id="84"/>
+        <w:t>18. 운영상태</w:t>
+      </w:r>
+      <w:bookmarkEnd w:id="72"/>
+    </w:p>
+    <w:p>
+      <w:pPr>
+        <w:widowControl/>
+      </w:pPr>
+      <w:r>
+        <w:t>Workspace App Bar의 운영상태에서 다음 구성요소를 확인합니다.</w:t>
+      </w:r>
     </w:p>
     <w:p>
       <w:pPr>
@@ -4964,7 +4971,7 @@
         </w:numPr>
       </w:pPr>
       <w:r>
-        <w:t>지식 권위·가중치·충돌·강제 RuleSet은 실제 질문 경로 전체에 배선된 것으로 검증되지 않았습니다.</w:t>
+        <w:t>Provider: LLM Provider와 선택 모델</w:t>
       </w:r>
     </w:p>
     <w:p>
@@ -4977,7 +4984,7 @@
         </w:numPr>
       </w:pPr>
       <w:r>
-        <w:t>실제 질문 실행은 선택된 단일 모델을 사용하며 다중 후보 자동 정렬과 자동 Fallback을 제공한다고 설명할 수 없습니다.</w:t>
+        <w:t>API: Workspace API</w:t>
       </w:r>
     </w:p>
     <w:p>
@@ -4990,7 +4997,7 @@
         </w:numPr>
       </w:pPr>
       <w:r>
-        <w:t>Source 선택기는 12개 파일 형식을 허용하지만 현재 운영 의미 이해가 모두 완성된 것은 아닙니다.</w:t>
+        <w:t>Storage: Database와 Object Storage</w:t>
       </w:r>
     </w:p>
     <w:p>
@@ -5003,7 +5010,7 @@
         </w:numPr>
       </w:pPr>
       <w:r>
-        <w:t>Mobile 앱의 설치·인증·공개 API·실기기 전체 흐름은 미검증입니다.</w:t>
+        <w:t>Sync: 승인 또는 전송 대기</w:t>
       </w:r>
     </w:p>
     <w:p>
@@ -5016,8 +5023,60 @@
         </w:numPr>
       </w:pPr>
       <w:r>
-        <w:t>Evidence Hub의 일부 화면은 prototype fixture이며 실제 서버 저장 성공을 증명하지 않습니다.</w:t>
-      </w:r>
+        <w:t>Queue: 처리 작업 대기와 실패</w:t>
+      </w:r>
+    </w:p>
+    <w:p>
+      <w:pPr>
+        <w:widowControl/>
+      </w:pPr>
+      <w:r>
+        <w:t>각 카드가 제공하는 LLM 설정 열기, 동기화 설정 열기, 상태 새로고침 같은 안전한 복구 동작만 사용합니다. 내부 Host, Port 또는 Stack 정보를 직접 입력해 우회하지 않습니다.</w:t>
+      </w:r>
+    </w:p>
+    <w:p>
+      <w:bookmarkStart w:id="73" w:name="toc_73"/>
+      <w:pPr>
+        <w:pStyle w:val="Heading1"/>
+      </w:pPr>
+      <w:r>
+        <w:t>19. 화면 설정과 접근성</w:t>
+      </w:r>
+      <w:bookmarkEnd w:id="73"/>
+    </w:p>
+    <w:p>
+      <w:pPr>
+        <w:widowControl/>
+      </w:pPr>
+      <w:r>
+        <w:t>Notebook 홈의 설정 → 화면 설정에서 시스템 설정, 밝게, 어둡게를 선택합니다. 화면 설정 초기화는 화면 Preference만 초기화하며 Notebook, Source, 질문과 산출물을 삭제하지 않습니다.</w:t>
+      </w:r>
+    </w:p>
+    <w:p>
+      <w:pPr>
+        <w:widowControl/>
+      </w:pPr>
+      <w:r>
+        <w:t>화면 설정의 초기값은 시스템 설정입니다(새 설치 시 admin에 적용). 다른 창(캡처 도구 등)을 다녀와도 노트북 화면의 입력과 오류 표시는 유지되며, 세션이 같으면 다시 불러오지 않고 가려진 화면만 다시 보여 줍니다. 세션이 바뀌었거나 만료되었으면 처음부터 다시 불러옵니다.</w:t>
+      </w:r>
+    </w:p>
+    <w:p>
+      <w:pPr>
+        <w:widowControl/>
+      </w:pPr>
+      <w:r>
+        <w:t>Dialog는 최초 입력 위치로 Focus를 이동하고, Tab 순환과 Escape 닫기를 지원합니다. 닫은 뒤에는 호출한 버튼으로 Focus가 돌아와야 합니다. Mobile 화면은 운영체제 글자 크기 조정을 지원하도록 설계되어 있습니다.</w:t>
+      </w:r>
+    </w:p>
+    <w:p>
+      <w:bookmarkStart w:id="74" w:name="toc_74"/>
+      <w:pPr>
+        <w:pStyle w:val="Heading1"/>
+      </w:pPr>
+      <w:r>
+        <w:t>20. Windows Desktop 사용 경계</w:t>
+      </w:r>
+      <w:bookmarkEnd w:id="74"/>
     </w:p>
     <w:p>
       <w:pPr>
@@ -5025,11 +5084,725 @@
         <w:ind w:left="540" w:hanging="271"/>
         <w:numPr>
           <w:ilvl w:val="0"/>
-          <w:numId w:val="49"/>
+          <w:numId w:val="50"/>
         </w:numPr>
       </w:pPr>
       <w:r>
+        <w:t>Windows 앱은 로컬 Source와 오프라인 Studio 초안을 사용할 수 있습니다.</w:t>
+      </w:r>
+    </w:p>
+    <w:p>
+      <w:pPr>
+        <w:spacing w:after="80" w:line="300" w:lineRule="auto"/>
+        <w:ind w:left="540" w:hanging="271"/>
+        <w:numPr>
+          <w:ilvl w:val="0"/>
+          <w:numId w:val="50"/>
+        </w:numPr>
+      </w:pPr>
+      <w:r>
+        <w:t>Cloud와 끊어진 상태에서는 외부 Provider 호출과 Cloud 전용 작업이 제한됩니다.</w:t>
+      </w:r>
+    </w:p>
+    <w:p>
+      <w:pPr>
+        <w:spacing w:after="80" w:line="300" w:lineRule="auto"/>
+        <w:ind w:left="540" w:hanging="271"/>
+        <w:numPr>
+          <w:ilvl w:val="0"/>
+          <w:numId w:val="50"/>
+        </w:numPr>
+      </w:pPr>
+      <w:r>
+        <w:t>재연결 후 자동 전체 동기화하지 않고 Preview와 승인 절차를 거칩니다.</w:t>
+      </w:r>
+    </w:p>
+    <w:p>
+      <w:pPr>
+        <w:spacing w:after="80" w:line="300" w:lineRule="auto"/>
+        <w:ind w:left="540" w:hanging="271"/>
+        <w:numPr>
+          <w:ilvl w:val="0"/>
+          <w:numId w:val="50"/>
+        </w:numPr>
+      </w:pPr>
+      <w:r>
+        <w:t>로컬 작업과 Cloud Version이 충돌하면 어느 한쪽을 자동 덮어쓰지 않습니다.</w:t>
+      </w:r>
+    </w:p>
+    <w:p>
+      <w:pPr>
+        <w:spacing w:after="80" w:line="300" w:lineRule="auto"/>
+        <w:ind w:left="540" w:hanging="271"/>
+        <w:numPr>
+          <w:ilvl w:val="0"/>
+          <w:numId w:val="50"/>
+        </w:numPr>
+      </w:pPr>
+      <w:r>
+        <w:t>Desktop에서 지원하는 Studio 범위는 현재 연결된 Local Service와 모델에 따라 달라집니다.</w:t>
+      </w:r>
+    </w:p>
+    <w:p>
+      <w:pPr>
+        <w:widowControl/>
+      </w:pPr>
+      <w:r>
+        <w:t>설치, 업데이트, 제거와 복구 절차는 제공된 설치 패키지의 운영 안내를 따릅니다. 현재 설치 패키지를 받지 못했다면 임의 개발 빌드를 사용하지 않습니다.</w:t>
+      </w:r>
+    </w:p>
+    <w:p>
+      <w:bookmarkStart w:id="75" w:name="toc_75"/>
+      <w:pPr>
+        <w:pStyle w:val="Heading1"/>
+      </w:pPr>
+      <w:r>
+        <w:t>21. Mobile 사용 경계</w:t>
+      </w:r>
+      <w:bookmarkEnd w:id="75"/>
+    </w:p>
+    <w:p>
+      <w:pPr>
+        <w:widowControl/>
+      </w:pPr>
+      <w:r>
+        <w:t>Mobile 계약상 허용되는 작업에는 제목·텍스트 블록·간단한 표 셀 편집, 검토 의견, 수정 요청, 승인·거부, 알림 처리와 Citation 열기가 포함됩니다.</w:t>
+      </w:r>
+    </w:p>
+    <w:p>
+      <w:pPr>
+        <w:widowControl/>
+      </w:pPr>
+      <w:r>
+        <w:t>섹션 구조 변경, Layout 변경, 표 구조 변경, 근거 연결 변경, 생성 설정 변경과 전체 재생성은 Mobile에서 허용되지 않으며 Web·Windows에서 계속해야 합니다.</w:t>
+      </w:r>
+    </w:p>
+    <w:p>
+      <w:pPr>
+        <w:widowControl/>
+      </w:pPr>
+      <w:r>
+        <w:t>현재 Mobile 실제 배포와 실기기 검증은 미완료 범위입니다. 조직이 승인한 설치본과 서버 연결이 없다면 Mobile Shell의 화면 계약만으로 실제 사용 가능하다고 판단하지 않습니다.</w:t>
+      </w:r>
+    </w:p>
+    <w:p>
+      <w:bookmarkStart w:id="76" w:name="toc_76"/>
+      <w:pPr>
+        <w:pStyle w:val="Heading1"/>
+      </w:pPr>
+      <w:r>
+        <w:t>22. 사용자 설명서 Hub</w:t>
+      </w:r>
+      <w:bookmarkEnd w:id="76"/>
+    </w:p>
+    <w:p>
+      <w:pPr>
+        <w:widowControl/>
+      </w:pPr>
+      <w:r>
+        <w:t>설명서는 웹 이미지에 포함되어 있어 별도 데이터 없이 새 설치에서도 /manual/daon-user-manual.pdf, .docx, .md로 열립니다.</w:t>
+      </w:r>
+    </w:p>
+    <w:p>
+      <w:pPr>
+        <w:spacing w:after="80" w:line="300" w:lineRule="auto"/>
+        <w:ind w:left="540" w:hanging="271"/>
+        <w:numPr>
+          <w:ilvl w:val="0"/>
+          <w:numId w:val="51"/>
+        </w:numPr>
+      </w:pPr>
+      <w:r>
+        <w:t>설정 → 사용자 설명서를 엽니다.</w:t>
+      </w:r>
+    </w:p>
+    <w:p>
+      <w:pPr>
+        <w:spacing w:after="80" w:line="300" w:lineRule="auto"/>
+        <w:ind w:left="540" w:hanging="271"/>
+        <w:numPr>
+          <w:ilvl w:val="0"/>
+          <w:numId w:val="51"/>
+        </w:numPr>
+      </w:pPr>
+      <w:r>
+        <w:t>검색란에 문서 제목이나 설명을 입력합니다.</w:t>
+      </w:r>
+    </w:p>
+    <w:p>
+      <w:pPr>
+        <w:spacing w:after="80" w:line="300" w:lineRule="auto"/>
+        <w:ind w:left="540" w:hanging="271"/>
+        <w:numPr>
+          <w:ilvl w:val="0"/>
+          <w:numId w:val="51"/>
+        </w:numPr>
+      </w:pPr>
+      <w:r>
+        <w:t>문서를 선택해 Web에서 읽습니다.</w:t>
+      </w:r>
+    </w:p>
+    <w:p>
+      <w:pPr>
+        <w:spacing w:after="80" w:line="300" w:lineRule="auto"/>
+        <w:ind w:left="540" w:hanging="271"/>
+        <w:numPr>
+          <w:ilvl w:val="0"/>
+          <w:numId w:val="51"/>
+        </w:numPr>
+      </w:pPr>
+      <w:r>
+        <w:t>필요한 경우 DOCX 또는 PDF를 선택해 내려받습니다.</w:t>
+      </w:r>
+    </w:p>
+    <w:p>
+      <w:pPr>
+        <w:spacing w:after="80" w:line="300" w:lineRule="auto"/>
+        <w:ind w:left="540" w:hanging="271"/>
+        <w:numPr>
+          <w:ilvl w:val="0"/>
+          <w:numId w:val="51"/>
+        </w:numPr>
+      </w:pPr>
+      <w:r>
+        <w:t>Hub 상단의 Release와 언어를 확인합니다.</w:t>
+      </w:r>
+    </w:p>
+    <w:p>
+      <w:pPr>
+        <w:widowControl/>
+      </w:pPr>
+      <w:r>
+        <w:t>다운로드는 허용된 same-origin 문서만 사용합니다. 내부 경로나 임의 URL을 조합하지 않습니다.</w:t>
+      </w:r>
+    </w:p>
+    <w:p>
+      <w:bookmarkStart w:id="77" w:name="toc_77"/>
+      <w:pPr>
+        <w:pStyle w:val="Heading1"/>
+      </w:pPr>
+      <w:r>
+        <w:t>23. 예상 결과와 보안 사용 원칙</w:t>
+      </w:r>
+      <w:bookmarkEnd w:id="77"/>
+    </w:p>
+    <w:p>
+      <w:pPr>
+        <w:spacing w:after="80" w:line="300" w:lineRule="auto"/>
+        <w:ind w:left="540" w:hanging="271"/>
+        <w:numPr>
+          <w:ilvl w:val="0"/>
+          <w:numId w:val="52"/>
+        </w:numPr>
+      </w:pPr>
+      <w:r>
+        <w:t>비밀번호, 이메일 인증 토큰, 재설정 토큰, API Key와 License 원문을 공유하지 않습니다.</w:t>
+      </w:r>
+    </w:p>
+    <w:p>
+      <w:pPr>
+        <w:spacing w:after="80" w:line="300" w:lineRule="auto"/>
+        <w:ind w:left="540" w:hanging="271"/>
+        <w:numPr>
+          <w:ilvl w:val="0"/>
+          <w:numId w:val="52"/>
+        </w:numPr>
+      </w:pPr>
+      <w:r>
+        <w:t>Source 원문이나 LLM 응답을 오류 로그에 그대로 붙이지 않습니다.</w:t>
+      </w:r>
+    </w:p>
+    <w:p>
+      <w:pPr>
+        <w:spacing w:after="80" w:line="300" w:lineRule="auto"/>
+        <w:ind w:left="540" w:hanging="271"/>
+        <w:numPr>
+          <w:ilvl w:val="0"/>
+          <w:numId w:val="52"/>
+        </w:numPr>
+      </w:pPr>
+      <w:r>
+        <w:t>권한 오류를 다른 계정, 내부 주소 또는 임시 Token으로 우회하지 않습니다.</w:t>
+      </w:r>
+    </w:p>
+    <w:p>
+      <w:pPr>
+        <w:spacing w:after="80" w:line="300" w:lineRule="auto"/>
+        <w:ind w:left="540" w:hanging="271"/>
+        <w:numPr>
+          <w:ilvl w:val="0"/>
+          <w:numId w:val="52"/>
+        </w:numPr>
+      </w:pPr>
+      <w:r>
+        <w:t>승인과 외부 전송은 화면에서 명시적으로 선택합니다.</w:t>
+      </w:r>
+    </w:p>
+    <w:p>
+      <w:pPr>
+        <w:spacing w:after="80" w:line="300" w:lineRule="auto"/>
+        <w:ind w:left="540" w:hanging="271"/>
+        <w:numPr>
+          <w:ilvl w:val="0"/>
+          <w:numId w:val="52"/>
+        </w:numPr>
+      </w:pPr>
+      <w:r>
+        <w:t>공용 PC에서는 로그아웃 후 브라우저를 닫습니다.</w:t>
+      </w:r>
+    </w:p>
+    <w:p>
+      <w:pPr>
+        <w:spacing w:after="80" w:line="300" w:lineRule="auto"/>
+        <w:ind w:left="540" w:hanging="271"/>
+        <w:numPr>
+          <w:ilvl w:val="0"/>
+          <w:numId w:val="52"/>
+        </w:numPr>
+      </w:pPr>
+      <w:r>
+        <w:t>권한이 축소되면 이전에 열었던 화면도 계속 접근할 수 있다고 가정하지 않습니다.</w:t>
+      </w:r>
+    </w:p>
+    <w:p>
+      <w:bookmarkStart w:id="78" w:name="toc_78"/>
+      <w:pPr>
+        <w:pStyle w:val="Heading1"/>
+      </w:pPr>
+      <w:r>
+        <w:t>24. 제한·오류 대응</w:t>
+      </w:r>
+      <w:bookmarkEnd w:id="78"/>
+    </w:p>
+    <w:p>
+      <w:bookmarkStart w:id="79" w:name="toc_79"/>
+      <w:pPr>
+        <w:pStyle w:val="Heading2"/>
+      </w:pPr>
+      <w:r>
+        <w:t>보호된 화면이 로그인 없이 보임</w:t>
+      </w:r>
+      <w:bookmarkEnd w:id="79"/>
+    </w:p>
+    <w:p>
+      <w:pPr>
+        <w:widowControl/>
+      </w:pPr>
+      <w:r>
+        <w:t>정상 상태가 아닙니다. 브라우저를 닫고 운영 담당자에게 접속 주소, 발생 시각과 화면 종류만 전달합니다. 화면에 포함된 업무 데이터는 공개 채널에 첨부하지 않습니다.</w:t>
+      </w:r>
+    </w:p>
+    <w:p>
+      <w:bookmarkStart w:id="80" w:name="toc_80"/>
+      <w:pPr>
+        <w:pStyle w:val="Heading2"/>
+      </w:pPr>
+      <w:r>
+        <w:t>로그아웃 후 Notebook이 다시 보임</w:t>
+      </w:r>
+      <w:bookmarkEnd w:id="80"/>
+    </w:p>
+    <w:p>
+      <w:pPr>
+        <w:widowControl/>
+      </w:pPr>
+      <w:r>
+        <w:t>페이지를 새로고침하고 /notebooks 직접 접근을 확인합니다. 계속 보이면 Session 종료 결함일 수 있으므로 추가 작업을 중지하고 신고합니다.</w:t>
+      </w:r>
+    </w:p>
+    <w:p>
+      <w:bookmarkStart w:id="81" w:name="toc_81"/>
+      <w:pPr>
+        <w:pStyle w:val="Heading2"/>
+      </w:pPr>
+      <w:r>
+        <w:t>Source 목록을 불러오지 못함</w:t>
+      </w:r>
+      <w:bookmarkEnd w:id="81"/>
+    </w:p>
+    <w:p>
+      <w:pPr>
+        <w:widowControl/>
+      </w:pPr>
+      <w:r>
+        <w:t>운영상태에서 API와 Storage를 확인하고 다시 불러옵니다. 기존 Source를 삭제하거나 같은 파일을 반복 등록하지 않습니다.</w:t>
+      </w:r>
+    </w:p>
+    <w:p>
+      <w:bookmarkStart w:id="82" w:name="toc_82"/>
+      <w:pPr>
+        <w:pStyle w:val="Heading2"/>
+      </w:pPr>
+      <w:r>
+        <w:t>Source가 `부분 이해` 또는 `검토 필요`</w:t>
+      </w:r>
+      <w:bookmarkEnd w:id="82"/>
+    </w:p>
+    <w:p>
+      <w:pPr>
+        <w:widowControl/>
+      </w:pPr>
+      <w:r>
+        <w:t>해당 Source만으로 최종 결과를 승인하지 않습니다. PDF로 변환해 재등록하거나 조직이 지원하는 Adapter 준비 여부를 확인합니다.</w:t>
+      </w:r>
+    </w:p>
+    <w:p>
+      <w:bookmarkStart w:id="83" w:name="toc_83"/>
+      <w:pPr>
+        <w:pStyle w:val="Heading2"/>
+      </w:pPr>
+      <w:r>
+        <w:t>선택 모델이 없음</w:t>
+      </w:r>
+      <w:bookmarkEnd w:id="83"/>
+    </w:p>
+    <w:p>
+      <w:pPr>
+        <w:widowControl/>
+      </w:pPr>
+      <w:r>
+        <w:t>LLM 설정의 Workspace 기본 모델에서 텍스트 생성에 사용할 연결과 모델을 선택했는지 확인합니다. 항목이 없으면 연결 활성 상태, 연결 확인 결과, 허용 모델과 현재 사용자의 Credential 범위를 확인합니다.</w:t>
+      </w:r>
+    </w:p>
+    <w:p>
+      <w:bookmarkStart w:id="84" w:name="toc_84"/>
+      <w:pPr>
+        <w:pStyle w:val="Heading2"/>
+      </w:pPr>
+      <w:r>
+        <w:t>Provider 연결 확인이 실패함</w:t>
+      </w:r>
+      <w:bookmarkEnd w:id="84"/>
+    </w:p>
+    <w:p>
+      <w:pPr>
+        <w:widowControl/>
+      </w:pPr>
+      <w:r>
+        <w:t>Endpoint의 오타, 서버에서의 접근 가능 여부, Key의 유효성, 실제 Gateway 모델 ID를 확인합니다. Key 원문이나 Provider 응답 본문을 오류 보고에 포함하지 않습니다. 키 교체만 필요한 경우 Endpoint를 다시 입력하거나 worker를 재생성하지 않습니다.</w:t>
+      </w:r>
+    </w:p>
+    <w:p>
+      <w:bookmarkStart w:id="85" w:name="toc_85"/>
+      <w:pPr>
+        <w:pStyle w:val="Heading2"/>
+      </w:pPr>
+      <w:r>
+        <w:t>외부 전송이 거부됨</w:t>
+      </w:r>
+      <w:bookmarkEnd w:id="85"/>
+    </w:p>
+    <w:p>
+      <w:pPr>
+        <w:widowControl/>
+      </w:pPr>
+      <w:r>
+        <w:t>조직 정책에서 허용 Provider, 목적지, 데이터 분류, 최대 전송량과 마스킹 조건을 확인합니다. 정책을 우회하지 않습니다.</w:t>
+      </w:r>
+    </w:p>
+    <w:p>
+      <w:bookmarkStart w:id="86" w:name="toc_86"/>
+      <w:pPr>
+        <w:pStyle w:val="Heading2"/>
+      </w:pPr>
+      <w:r>
+        <w:t>Studio 버튼이 비활성화됨</w:t>
+      </w:r>
+      <w:bookmarkEnd w:id="86"/>
+    </w:p>
+    <w:p>
+      <w:pPr>
+        <w:widowControl/>
+      </w:pPr>
+      <w:r>
+        <w:t>필수 생성 설정, Source Version, 설정 확인 여부, 검토·승인 단계와 현재 권한을 확인합니다.</w:t>
+      </w:r>
+    </w:p>
+    <w:p>
+      <w:bookmarkStart w:id="87" w:name="toc_87"/>
+      <w:pPr>
+        <w:pStyle w:val="Heading2"/>
+      </w:pPr>
+      <w:r>
+        <w:t>내보내기가 되지 않음</w:t>
+      </w:r>
+      <w:bookmarkEnd w:id="87"/>
+    </w:p>
+    <w:p>
+      <w:pPr>
+        <w:widowControl/>
+      </w:pPr>
+      <w:r>
+        <w:t>산출물 상태가 승인됨인지, 선택한 형식이 해당 유형에 허용되는지, 라이선스와 현재 권한이 유효한지 확인합니다.</w:t>
+      </w:r>
+    </w:p>
+    <w:p>
+      <w:bookmarkStart w:id="88" w:name="toc_88"/>
+      <w:pPr>
+        <w:pStyle w:val="Heading2"/>
+      </w:pPr>
+      <w:r>
+        <w:t>오류를 담당자에게 전달할 때</w:t>
+      </w:r>
+      <w:bookmarkEnd w:id="88"/>
+    </w:p>
+    <w:p>
+      <w:pPr>
+        <w:widowControl/>
+      </w:pPr>
+      <w:r>
+        <w:t>다음 정보만 전달합니다.</w:t>
+      </w:r>
+    </w:p>
+    <w:p>
+      <w:pPr>
+        <w:spacing w:after="80" w:line="300" w:lineRule="auto"/>
+        <w:ind w:left="540" w:hanging="271"/>
+        <w:numPr>
+          <w:ilvl w:val="0"/>
+          <w:numId w:val="53"/>
+        </w:numPr>
+      </w:pPr>
+      <w:r>
+        <w:t>발생 시각</w:t>
+      </w:r>
+    </w:p>
+    <w:p>
+      <w:pPr>
+        <w:spacing w:after="80" w:line="300" w:lineRule="auto"/>
+        <w:ind w:left="540" w:hanging="271"/>
+        <w:numPr>
+          <w:ilvl w:val="0"/>
+          <w:numId w:val="53"/>
+        </w:numPr>
+      </w:pPr>
+      <w:r>
+        <w:t>사용한 플랫폼과 화면 이름</w:t>
+      </w:r>
+    </w:p>
+    <w:p>
+      <w:pPr>
+        <w:spacing w:after="80" w:line="300" w:lineRule="auto"/>
+        <w:ind w:left="540" w:hanging="271"/>
+        <w:numPr>
+          <w:ilvl w:val="0"/>
+          <w:numId w:val="53"/>
+        </w:numPr>
+      </w:pPr>
+      <w:r>
+        <w:t>수행하려던 동작</w:t>
+      </w:r>
+    </w:p>
+    <w:p>
+      <w:pPr>
+        <w:spacing w:after="80" w:line="300" w:lineRule="auto"/>
+        <w:ind w:left="540" w:hanging="271"/>
+        <w:numPr>
+          <w:ilvl w:val="0"/>
+          <w:numId w:val="53"/>
+        </w:numPr>
+      </w:pPr>
+      <w:r>
+        <w:t>화면에 표시된 안전한 오류 코드 또는 문구</w:t>
+      </w:r>
+    </w:p>
+    <w:p>
+      <w:pPr>
+        <w:spacing w:after="80" w:line="300" w:lineRule="auto"/>
+        <w:ind w:left="540" w:hanging="271"/>
+        <w:numPr>
+          <w:ilvl w:val="0"/>
+          <w:numId w:val="53"/>
+        </w:numPr>
+      </w:pPr>
+      <w:r>
+        <w:t>재현 여부</w:t>
+      </w:r>
+    </w:p>
+    <w:p>
+      <w:pPr>
+        <w:widowControl/>
+      </w:pPr>
+      <w:r>
+        <w:t>비밀번호, Token, Source 원문, 내부 주소와 전체 응답 본문은 전달하지 않습니다.</w:t>
+      </w:r>
+    </w:p>
+    <w:p>
+      <w:bookmarkStart w:id="89" w:name="toc_89"/>
+      <w:pPr>
+        <w:pStyle w:val="Heading1"/>
+      </w:pPr>
+      <w:r>
+        <w:t>25. 현재 구현·검증 제한</w:t>
+      </w:r>
+      <w:bookmarkEnd w:id="89"/>
+    </w:p>
+    <w:p>
+      <w:pPr>
+        <w:spacing w:after="80" w:line="300" w:lineRule="auto"/>
+        <w:ind w:left="540" w:hanging="271"/>
+        <w:numPr>
+          <w:ilvl w:val="0"/>
+          <w:numId w:val="54"/>
+        </w:numPr>
+      </w:pPr>
+      <w:r>
+        <w:t>지식 권위·가중치·충돌·강제 RuleSet은 실제 질문 경로 전체에 배선된 것으로 검증되지 않았습니다.</w:t>
+      </w:r>
+    </w:p>
+    <w:p>
+      <w:pPr>
+        <w:spacing w:after="80" w:line="300" w:lineRule="auto"/>
+        <w:ind w:left="540" w:hanging="271"/>
+        <w:numPr>
+          <w:ilvl w:val="0"/>
+          <w:numId w:val="54"/>
+        </w:numPr>
+      </w:pPr>
+      <w:r>
+        <w:t>실제 질문 실행은 선택된 단일 모델을 사용하며 다중 후보 자동 정렬과 자동 Fallback을 제공한다고 설명할 수 없습니다.</w:t>
+      </w:r>
+    </w:p>
+    <w:p>
+      <w:pPr>
+        <w:spacing w:after="80" w:line="300" w:lineRule="auto"/>
+        <w:ind w:left="540" w:hanging="271"/>
+        <w:numPr>
+          <w:ilvl w:val="0"/>
+          <w:numId w:val="54"/>
+        </w:numPr>
+      </w:pPr>
+      <w:r>
+        <w:t>Source 선택기는 12개 파일 형식을 허용하지만 현재 운영 의미 이해가 모두 완성된 것은 아닙니다.</w:t>
+      </w:r>
+    </w:p>
+    <w:p>
+      <w:pPr>
+        <w:spacing w:after="80" w:line="300" w:lineRule="auto"/>
+        <w:ind w:left="540" w:hanging="271"/>
+        <w:numPr>
+          <w:ilvl w:val="0"/>
+          <w:numId w:val="54"/>
+        </w:numPr>
+      </w:pPr>
+      <w:r>
+        <w:t>Mobile 앱의 설치·인증·공개 API·실기기 전체 흐름은 미검증입니다.</w:t>
+      </w:r>
+    </w:p>
+    <w:p>
+      <w:pPr>
+        <w:spacing w:after="80" w:line="300" w:lineRule="auto"/>
+        <w:ind w:left="540" w:hanging="271"/>
+        <w:numPr>
+          <w:ilvl w:val="0"/>
+          <w:numId w:val="54"/>
+        </w:numPr>
+      </w:pPr>
+      <w:r>
+        <w:t>Evidence Hub의 일부 화면은 prototype fixture이며 실제 서버 저장 성공을 증명하지 않습니다.</w:t>
+      </w:r>
+    </w:p>
+    <w:p>
+      <w:pPr>
+        <w:spacing w:after="80" w:line="300" w:lineRule="auto"/>
+        <w:ind w:left="540" w:hanging="271"/>
+        <w:numPr>
+          <w:ilvl w:val="0"/>
+          <w:numId w:val="54"/>
+        </w:numPr>
+      </w:pPr>
+      <w:r>
         <w:t>브라우저·기기별 전체 사용자 시나리오는 별도 실제 QA가 필요합니다.</w:t>
+      </w:r>
+    </w:p>
+    <w:p>
+      <w:bookmarkStart w:id="90" w:name="toc_90"/>
+      <w:pPr>
+        <w:pStyle w:val="Heading1"/>
+      </w:pPr>
+      <w:r>
+        <w:t>26. 새 설치와 초기 데이터</w:t>
+      </w:r>
+      <w:bookmarkEnd w:id="90"/>
+    </w:p>
+    <w:p>
+      <w:pPr>
+        <w:widowControl/>
+      </w:pPr>
+      <w:r>
+        <w:t>새 서버에 설치하면 다음 초기 데이터를 사용합니다. 사용자 데이터(노트북, Source, 산출물)는 포함하지 않습니다.</w:t>
+      </w:r>
+    </w:p>
+    <w:p>
+      <w:pPr>
+        <w:widowControl/>
+      </w:pPr>
+      <w:r>
+        <w:t>| 항목 | 내용 |</w:t>
+      </w:r>
+    </w:p>
+    <w:p>
+      <w:pPr>
+        <w:widowControl/>
+      </w:pPr>
+      <w:r>
+        <w:t>| --- | --- |</w:t>
+      </w:r>
+    </w:p>
+    <w:p>
+      <w:pPr>
+        <w:widowControl/>
+      </w:pPr>
+      <w:r>
+        <w:t>| admin 계정 | 앱이 첫 기동 때 admin / admin으로 만듭니다. 첫 로그인에서 비밀번호를 바꿔야 합니다. 시드에는 비밀번호·해시를 넣지 않습니다. |</w:t>
+      </w:r>
+    </w:p>
+    <w:p>
+      <w:pPr>
+        <w:widowControl/>
+      </w:pPr>
+      <w:r>
+        <w:t>| 조직 외부 전송 정책 | 16장의 초기값(개발 단계 설치). 그 밖의 설치는 외부 전송 차단으로 시작합니다. |</w:t>
+      </w:r>
+    </w:p>
+    <w:p>
+      <w:pPr>
+        <w:widowControl/>
+      </w:pPr>
+      <w:r>
+        <w:t>| Provider | 연결 12개, 허용 모델 35개와 카탈로그. Key와 확인 상태는 없으며(unverified) 관리자가 Provider별로 Key를 넣고 연결 시험을 합니다. |</w:t>
+      </w:r>
+    </w:p>
+    <w:p>
+      <w:pPr>
+        <w:widowControl/>
+      </w:pPr>
+      <w:r>
+        <w:t>| 화면 설정 | admin 테마 시스템 설정 |</w:t>
+      </w:r>
+    </w:p>
+    <w:p>
+      <w:pPr>
+        <w:widowControl/>
+      </w:pPr>
+      <w:r>
+        <w:t>| 라이선스 | 서명된 라이선스는 미리 만들 수 없습니다. 개발 단계 설치(DAON_DEVELOPMENT_STAGE=true)는 라이선스 없이 전 기능을 쓰고, 운영 전환 시 17장대로 라이선스 파일을 적용합니다. |</w:t>
+      </w:r>
+    </w:p>
+    <w:p>
+      <w:pPr>
+        <w:widowControl/>
+      </w:pPr>
+      <w:r>
+        <w:t>| 사용자 설명서 | 웹 이미지에 포함 |</w:t>
+      </w:r>
+    </w:p>
+    <w:p>
+      <w:pPr>
+        <w:widowControl/>
+      </w:pPr>
+      <w:r>
+        <w:t>설치 담당자는 deploy/daon2-user/README.md의 ysna-server 절차(ysna-bootstrap.sh, ysna-deploy.sh)를 따릅니다. 시드는 비어 있는 DB에만 적용되고, 이미 데이터가 있으면 건드리지 않습니다.</w:t>
       </w:r>
     </w:p>
     <w:sectPr>
@@ -5552,8 +6325,8 @@
   <w:abstractNum w:abstractNumId="28">
     <w:lvl w:ilvl="0">
       <w:start w:val="1"/>
-      <w:numFmt w:val="decimal"/>
-      <w:lvlText w:val="%1."/>
+      <w:numFmt w:val="bullet"/>
+      <w:lvlText w:val="•"/>
       <w:suff w:val="space"/>
       <w:pPr>
         <w:ind w:start="540" w:hanging="271"/>
@@ -5594,8 +6367,8 @@
   <w:abstractNum w:abstractNumId="31">
     <w:lvl w:ilvl="0">
       <w:start w:val="1"/>
-      <w:numFmt w:val="bullet"/>
-      <w:lvlText w:val="•"/>
+      <w:numFmt w:val="decimal"/>
+      <w:lvlText w:val="%1."/>
       <w:suff w:val="space"/>
       <w:pPr>
         <w:ind w:start="540" w:hanging="271"/>
@@ -5650,8 +6423,8 @@
   <w:abstractNum w:abstractNumId="35">
     <w:lvl w:ilvl="0">
       <w:start w:val="1"/>
-      <w:numFmt w:val="decimal"/>
-      <w:lvlText w:val="%1."/>
+      <w:numFmt w:val="bullet"/>
+      <w:lvlText w:val="•"/>
       <w:suff w:val="space"/>
       <w:pPr>
         <w:ind w:start="540" w:hanging="271"/>
@@ -5664,8 +6437,8 @@
   <w:abstractNum w:abstractNumId="36">
     <w:lvl w:ilvl="0">
       <w:start w:val="1"/>
-      <w:numFmt w:val="bullet"/>
-      <w:lvlText w:val="•"/>
+      <w:numFmt w:val="decimal"/>
+      <w:lvlText w:val="%1."/>
       <w:suff w:val="space"/>
       <w:pPr>
         <w:ind w:start="540" w:hanging="271"/>
@@ -5678,8 +6451,8 @@
   <w:abstractNum w:abstractNumId="37">
     <w:lvl w:ilvl="0">
       <w:start w:val="1"/>
-      <w:numFmt w:val="decimal"/>
-      <w:lvlText w:val="%1."/>
+      <w:numFmt w:val="bullet"/>
+      <w:lvlText w:val="•"/>
       <w:suff w:val="space"/>
       <w:pPr>
         <w:ind w:start="540" w:hanging="271"/>
@@ -5692,8 +6465,8 @@
   <w:abstractNum w:abstractNumId="38">
     <w:lvl w:ilvl="0">
       <w:start w:val="1"/>
-      <w:numFmt w:val="bullet"/>
-      <w:lvlText w:val="•"/>
+      <w:numFmt w:val="decimal"/>
+      <w:lvlText w:val="%1."/>
       <w:suff w:val="space"/>
       <w:pPr>
         <w:ind w:start="540" w:hanging="271"/>
@@ -5720,8 +6493,8 @@
   <w:abstractNum w:abstractNumId="40">
     <w:lvl w:ilvl="0">
       <w:start w:val="1"/>
-      <w:numFmt w:val="decimal"/>
-      <w:lvlText w:val="%1."/>
+      <w:numFmt w:val="bullet"/>
+      <w:lvlText w:val="•"/>
       <w:suff w:val="space"/>
       <w:pPr>
         <w:ind w:start="540" w:hanging="271"/>
@@ -5734,8 +6507,8 @@
   <w:abstractNum w:abstractNumId="41">
     <w:lvl w:ilvl="0">
       <w:start w:val="1"/>
-      <w:numFmt w:val="bullet"/>
-      <w:lvlText w:val="•"/>
+      <w:numFmt w:val="decimal"/>
+      <w:lvlText w:val="%1."/>
       <w:suff w:val="space"/>
       <w:pPr>
         <w:ind w:start="540" w:hanging="271"/>
@@ -5748,8 +6521,8 @@
   <w:abstractNum w:abstractNumId="42">
     <w:lvl w:ilvl="0">
       <w:start w:val="1"/>
-      <w:numFmt w:val="decimal"/>
-      <w:lvlText w:val="%1."/>
+      <w:numFmt w:val="bullet"/>
+      <w:lvlText w:val="•"/>
       <w:suff w:val="space"/>
       <w:pPr>
         <w:ind w:start="540" w:hanging="271"/>
@@ -5762,8 +6535,8 @@
   <w:abstractNum w:abstractNumId="43">
     <w:lvl w:ilvl="0">
       <w:start w:val="1"/>
-      <w:numFmt w:val="bullet"/>
-      <w:lvlText w:val="•"/>
+      <w:numFmt w:val="decimal"/>
+      <w:lvlText w:val="%1."/>
       <w:suff w:val="space"/>
       <w:pPr>
         <w:ind w:start="540" w:hanging="271"/>
@@ -5818,8 +6591,8 @@
   <w:abstractNum w:abstractNumId="47">
     <w:lvl w:ilvl="0">
       <w:start w:val="1"/>
-      <w:numFmt w:val="bullet"/>
-      <w:lvlText w:val="•"/>
+      <w:numFmt w:val="decimal"/>
+      <w:lvlText w:val="%1."/>
       <w:suff w:val="space"/>
       <w:pPr>
         <w:ind w:start="540" w:hanging="271"/>
@@ -5842,6 +6615,76 @@
   </w:abstractNum>
   <w:num w:numId="49">
     <w:abstractNumId w:val="48"/>
+  </w:num>
+  <w:abstractNum w:abstractNumId="49">
+    <w:lvl w:ilvl="0">
+      <w:start w:val="1"/>
+      <w:numFmt w:val="bullet"/>
+      <w:lvlText w:val="•"/>
+      <w:suff w:val="space"/>
+      <w:pPr>
+        <w:ind w:start="540" w:hanging="271"/>
+      </w:pPr>
+    </w:lvl>
+  </w:abstractNum>
+  <w:num w:numId="50">
+    <w:abstractNumId w:val="49"/>
+  </w:num>
+  <w:abstractNum w:abstractNumId="50">
+    <w:lvl w:ilvl="0">
+      <w:start w:val="1"/>
+      <w:numFmt w:val="decimal"/>
+      <w:lvlText w:val="%1."/>
+      <w:suff w:val="space"/>
+      <w:pPr>
+        <w:ind w:start="540" w:hanging="271"/>
+      </w:pPr>
+    </w:lvl>
+  </w:abstractNum>
+  <w:num w:numId="51">
+    <w:abstractNumId w:val="50"/>
+  </w:num>
+  <w:abstractNum w:abstractNumId="51">
+    <w:lvl w:ilvl="0">
+      <w:start w:val="1"/>
+      <w:numFmt w:val="bullet"/>
+      <w:lvlText w:val="•"/>
+      <w:suff w:val="space"/>
+      <w:pPr>
+        <w:ind w:start="540" w:hanging="271"/>
+      </w:pPr>
+    </w:lvl>
+  </w:abstractNum>
+  <w:num w:numId="52">
+    <w:abstractNumId w:val="51"/>
+  </w:num>
+  <w:abstractNum w:abstractNumId="52">
+    <w:lvl w:ilvl="0">
+      <w:start w:val="1"/>
+      <w:numFmt w:val="bullet"/>
+      <w:lvlText w:val="•"/>
+      <w:suff w:val="space"/>
+      <w:pPr>
+        <w:ind w:start="540" w:hanging="271"/>
+      </w:pPr>
+    </w:lvl>
+  </w:abstractNum>
+  <w:num w:numId="53">
+    <w:abstractNumId w:val="52"/>
+  </w:num>
+  <w:abstractNum w:abstractNumId="53">
+    <w:lvl w:ilvl="0">
+      <w:start w:val="1"/>
+      <w:numFmt w:val="bullet"/>
+      <w:lvlText w:val="•"/>
+      <w:suff w:val="space"/>
+      <w:pPr>
+        <w:ind w:start="540" w:hanging="271"/>
+      </w:pPr>
+    </w:lvl>
+  </w:abstractNum>
+  <w:num w:numId="54">
+    <w:abstractNumId w:val="53"/>
   </w:num>
 </w:numbering>
 </file>

</xml_diff>